<commit_message>
Add completed logbook Weeks 1-14 with screenshots
</commit_message>
<xml_diff>
--- a/BIT3208_Logbook_Marciah_Muringi_Gichohi.docx
+++ b/BIT3208_Logbook_Marciah_Muringi_Gichohi.docx
@@ -1341,7 +1341,7 @@
         </w:rPr>
         <w:lastRenderedPageBreak/>
         <w:drawing>
-          <wp:inline distT="0" distB="0" distL="0" distR="0" wp14:anchorId="25B8207F" wp14:editId="25DA6FB9">
+          <wp:inline distT="0" distB="0" distL="0" distR="0" wp14:anchorId="25B8207F" wp14:editId="3A732B8F">
             <wp:extent cx="4762875" cy="3121820"/>
             <wp:effectExtent l="0" t="0" r="0" b="0"/>
             <wp:docPr id="1988837236" name="Picture 6"/>
@@ -1522,7 +1522,7 @@
           <w:noProof/>
         </w:rPr>
         <w:drawing>
-          <wp:inline distT="0" distB="0" distL="0" distR="0" wp14:anchorId="502434C7" wp14:editId="761F3252">
+          <wp:inline distT="0" distB="0" distL="0" distR="0" wp14:anchorId="502434C7" wp14:editId="6B947AEB">
             <wp:extent cx="2590800" cy="3370521"/>
             <wp:effectExtent l="0" t="0" r="0" b="0"/>
             <wp:docPr id="1161001013" name="Picture 7"/>
@@ -3096,25 +3096,16 @@
       <w:pPr>
         <w:pStyle w:val="BodyText"/>
         <w:rPr>
-          <w:i/>
-          <w:iCs/>
-        </w:rPr>
-      </w:pPr>
-    </w:p>
-    <w:p>
-      <w:pPr>
-        <w:pStyle w:val="BodyText"/>
-        <w:rPr>
-          <w:b/>
-          <w:bCs/>
-        </w:rPr>
-      </w:pPr>
-      <w:r>
-        <w:rPr>
-          <w:b/>
-          <w:bCs/>
-        </w:rPr>
-        <w:t>WEEK 7: Architecture &amp; Design -N-Tier System Design</w:t>
+          <w:b/>
+          <w:bCs/>
+        </w:rPr>
+      </w:pPr>
+      <w:r>
+        <w:rPr>
+          <w:b/>
+          <w:bCs/>
+        </w:rPr>
+        <w:t>WEEK 6: Database Integration and CRUD Operations</w:t>
       </w:r>
     </w:p>
     <w:p>
@@ -3129,24 +3120,19 @@
         <w:t xml:space="preserve">Title: </w:t>
       </w:r>
       <w:r>
-        <w:t>Architecture &amp; Design -N-Tier System Design</w:t>
-      </w:r>
-    </w:p>
-    <w:p>
-      <w:pPr>
-        <w:pStyle w:val="BodyText"/>
-      </w:pPr>
-    </w:p>
-    <w:p>
-      <w:pPr>
-        <w:pStyle w:val="BodyText"/>
-      </w:pPr>
-      <w:r>
-        <w:rPr>
-          <w:b/>
-          <w:bCs/>
-        </w:rPr>
-        <w:t>Fig 1: SmartShop N-Tier Architecture Diagram</w:t>
+        <w:t>Database-Driven Application with Full CRUD Operations</w:t>
+      </w:r>
+    </w:p>
+    <w:p>
+      <w:pPr>
+        <w:pStyle w:val="BodyText"/>
+      </w:pPr>
+      <w:r>
+        <w:rPr>
+          <w:b/>
+          <w:bCs/>
+        </w:rPr>
+        <w:t>Fig 1: smartshop_db Database Tables in phpMyAdmin</w:t>
       </w:r>
     </w:p>
     <w:p>
@@ -3157,12 +3143,11 @@
         <w:rPr>
           <w:noProof/>
         </w:rPr>
-        <w:lastRenderedPageBreak/>
         <w:drawing>
-          <wp:inline distT="0" distB="0" distL="0" distR="0" wp14:anchorId="706CE902" wp14:editId="1D33F11B">
-            <wp:extent cx="3924848" cy="6468378"/>
-            <wp:effectExtent l="0" t="0" r="0" b="8890"/>
-            <wp:docPr id="1120663952" name="Picture 1"/>
+          <wp:inline distT="0" distB="0" distL="0" distR="0" wp14:anchorId="167DCC0D" wp14:editId="770BFA54">
+            <wp:extent cx="5029052" cy="3570051"/>
+            <wp:effectExtent l="0" t="0" r="0" b="0"/>
+            <wp:docPr id="1272109232" name="Picture 1"/>
             <wp:cNvGraphicFramePr>
               <a:graphicFrameLocks xmlns:a="http://schemas.openxmlformats.org/drawingml/2006/main" noChangeAspect="1"/>
             </wp:cNvGraphicFramePr>
@@ -3170,7 +3155,7 @@
               <a:graphicData uri="http://schemas.openxmlformats.org/drawingml/2006/picture">
                 <pic:pic xmlns:pic="http://schemas.openxmlformats.org/drawingml/2006/picture">
                   <pic:nvPicPr>
-                    <pic:cNvPr id="1120663952" name=""/>
+                    <pic:cNvPr id="1272109232" name=""/>
                     <pic:cNvPicPr/>
                   </pic:nvPicPr>
                   <pic:blipFill>
@@ -3182,7 +3167,7 @@
                   <pic:spPr>
                     <a:xfrm>
                       <a:off x="0" y="0"/>
-                      <a:ext cx="3924848" cy="6468378"/>
+                      <a:ext cx="5042334" cy="3579480"/>
                     </a:xfrm>
                     <a:prstGeom prst="rect">
                       <a:avLst/>
@@ -3199,21 +3184,6 @@
       <w:pPr>
         <w:pStyle w:val="BodyText"/>
       </w:pPr>
-      <w:r>
-        <w:t>Fig 1: Three-tier architecture diagram for SmartShop showing the Presentation Tier (browser/EJS views), Application Tier (Node.js/Express server and routes), and Data Tier (MySQL database), created in Draw.io.</w:t>
-      </w:r>
-    </w:p>
-    <w:p>
-      <w:pPr>
-        <w:pStyle w:val="BodyText"/>
-      </w:pPr>
-      <w:r>
-        <w:rPr>
-          <w:b/>
-          <w:bCs/>
-        </w:rPr>
-        <w:t>Fig 2: Folder Structure Reflecting N-Tier Separation</w:t>
-      </w:r>
     </w:p>
     <w:p>
       <w:pPr>
@@ -3225,10 +3195,10 @@
         </w:rPr>
         <w:lastRenderedPageBreak/>
         <w:drawing>
-          <wp:inline distT="0" distB="0" distL="0" distR="0" wp14:anchorId="10181FB5" wp14:editId="08851A5B">
-            <wp:extent cx="5458587" cy="2876951"/>
-            <wp:effectExtent l="0" t="0" r="8890" b="0"/>
-            <wp:docPr id="2019984502" name="Picture 1"/>
+          <wp:inline distT="0" distB="0" distL="0" distR="0" wp14:anchorId="602C9E21" wp14:editId="49D43602">
+            <wp:extent cx="5602357" cy="3988340"/>
+            <wp:effectExtent l="0" t="0" r="0" b="0"/>
+            <wp:docPr id="1487512650" name="Picture 1"/>
             <wp:cNvGraphicFramePr>
               <a:graphicFrameLocks xmlns:a="http://schemas.openxmlformats.org/drawingml/2006/main" noChangeAspect="1"/>
             </wp:cNvGraphicFramePr>
@@ -3236,11 +3206,17 @@
               <a:graphicData uri="http://schemas.openxmlformats.org/drawingml/2006/picture">
                 <pic:pic xmlns:pic="http://schemas.openxmlformats.org/drawingml/2006/picture">
                   <pic:nvPicPr>
-                    <pic:cNvPr id="2019984502" name=""/>
+                    <pic:cNvPr id="1487512650" name="Picture 1487512650"/>
                     <pic:cNvPicPr/>
                   </pic:nvPicPr>
                   <pic:blipFill>
-                    <a:blip r:embed="rId34"/>
+                    <a:blip r:embed="rId34">
+                      <a:extLst>
+                        <a:ext uri="{28A0092B-C50C-407E-A947-70E740481C1C}">
+                          <a14:useLocalDpi xmlns:a14="http://schemas.microsoft.com/office/drawing/2010/main" val="0"/>
+                        </a:ext>
+                      </a:extLst>
+                    </a:blip>
                     <a:stretch>
                       <a:fillRect/>
                     </a:stretch>
@@ -3248,7 +3224,7 @@
                   <pic:spPr>
                     <a:xfrm>
                       <a:off x="0" y="0"/>
-                      <a:ext cx="5458587" cy="2876951"/>
+                      <a:ext cx="5623892" cy="4003671"/>
                     </a:xfrm>
                     <a:prstGeom prst="rect">
                       <a:avLst/>
@@ -3265,21 +3241,6 @@
       <w:pPr>
         <w:pStyle w:val="BodyText"/>
       </w:pPr>
-      <w:r>
-        <w:t>Fig 2: SmartShop project folder structure in VS Code showing views/ (Presentation Tier), routes/ (Application Tier), and config/db.js (Data Tier) as separate layers.</w:t>
-      </w:r>
-    </w:p>
-    <w:p>
-      <w:pPr>
-        <w:pStyle w:val="BodyText"/>
-      </w:pPr>
-      <w:r>
-        <w:rPr>
-          <w:b/>
-          <w:bCs/>
-        </w:rPr>
-        <w:t>Fig 3: Middleware and Route Handler in server.js</w:t>
-      </w:r>
     </w:p>
     <w:p>
       <w:pPr>
@@ -3291,10 +3252,10 @@
         </w:rPr>
         <w:lastRenderedPageBreak/>
         <w:drawing>
-          <wp:inline distT="0" distB="0" distL="0" distR="0" wp14:anchorId="00AFD460" wp14:editId="21221F9D">
-            <wp:extent cx="5943600" cy="4685030"/>
+          <wp:inline distT="0" distB="0" distL="0" distR="0" wp14:anchorId="17E1B281" wp14:editId="0F9C1B52">
+            <wp:extent cx="4931410" cy="3842426"/>
             <wp:effectExtent l="0" t="0" r="0" b="0"/>
-            <wp:docPr id="474758793" name="Picture 1"/>
+            <wp:docPr id="1535208903" name="Picture 2"/>
             <wp:cNvGraphicFramePr>
               <a:graphicFrameLocks xmlns:a="http://schemas.openxmlformats.org/drawingml/2006/main" noChangeAspect="1"/>
             </wp:cNvGraphicFramePr>
@@ -3302,11 +3263,17 @@
               <a:graphicData uri="http://schemas.openxmlformats.org/drawingml/2006/picture">
                 <pic:pic xmlns:pic="http://schemas.openxmlformats.org/drawingml/2006/picture">
                   <pic:nvPicPr>
-                    <pic:cNvPr id="474758793" name=""/>
+                    <pic:cNvPr id="1535208903" name="Picture 1535208903"/>
                     <pic:cNvPicPr/>
                   </pic:nvPicPr>
                   <pic:blipFill>
-                    <a:blip r:embed="rId35"/>
+                    <a:blip r:embed="rId35">
+                      <a:extLst>
+                        <a:ext uri="{28A0092B-C50C-407E-A947-70E740481C1C}">
+                          <a14:useLocalDpi xmlns:a14="http://schemas.microsoft.com/office/drawing/2010/main" val="0"/>
+                        </a:ext>
+                      </a:extLst>
+                    </a:blip>
                     <a:stretch>
                       <a:fillRect/>
                     </a:stretch>
@@ -3314,7 +3281,7 @@
                   <pic:spPr>
                     <a:xfrm>
                       <a:off x="0" y="0"/>
-                      <a:ext cx="5943600" cy="4685030"/>
+                      <a:ext cx="4941181" cy="3850039"/>
                     </a:xfrm>
                     <a:prstGeom prst="rect">
                       <a:avLst/>
@@ -3331,21 +3298,6 @@
       <w:pPr>
         <w:pStyle w:val="BodyText"/>
       </w:pPr>
-      <w:r>
-        <w:t>Fig 3: server.js showing middleware setup and route mounting that forms the Application Tier — handling requests between the browser and the database.</w:t>
-      </w:r>
-    </w:p>
-    <w:p>
-      <w:pPr>
-        <w:pStyle w:val="BodyText"/>
-      </w:pPr>
-      <w:r>
-        <w:rPr>
-          <w:b/>
-          <w:bCs/>
-        </w:rPr>
-        <w:t>Fig 4: Security Implementation – requireLogin Middleware</w:t>
-      </w:r>
     </w:p>
     <w:p>
       <w:pPr>
@@ -3357,10 +3309,10 @@
         </w:rPr>
         <w:lastRenderedPageBreak/>
         <w:drawing>
-          <wp:inline distT="0" distB="0" distL="0" distR="0" wp14:anchorId="5C4BF88A" wp14:editId="09C254CF">
-            <wp:extent cx="5943600" cy="3791585"/>
+          <wp:inline distT="0" distB="0" distL="0" distR="0" wp14:anchorId="5C363ADF" wp14:editId="559B77C6">
+            <wp:extent cx="5097092" cy="5068111"/>
             <wp:effectExtent l="0" t="0" r="0" b="0"/>
-            <wp:docPr id="1088107541" name="Picture 1"/>
+            <wp:docPr id="1925096026" name="Picture 3"/>
             <wp:cNvGraphicFramePr>
               <a:graphicFrameLocks xmlns:a="http://schemas.openxmlformats.org/drawingml/2006/main" noChangeAspect="1"/>
             </wp:cNvGraphicFramePr>
@@ -3368,11 +3320,17 @@
               <a:graphicData uri="http://schemas.openxmlformats.org/drawingml/2006/picture">
                 <pic:pic xmlns:pic="http://schemas.openxmlformats.org/drawingml/2006/picture">
                   <pic:nvPicPr>
-                    <pic:cNvPr id="1088107541" name=""/>
+                    <pic:cNvPr id="1925096026" name="Picture 1925096026"/>
                     <pic:cNvPicPr/>
                   </pic:nvPicPr>
                   <pic:blipFill>
-                    <a:blip r:embed="rId36"/>
+                    <a:blip r:embed="rId36">
+                      <a:extLst>
+                        <a:ext uri="{28A0092B-C50C-407E-A947-70E740481C1C}">
+                          <a14:useLocalDpi xmlns:a14="http://schemas.microsoft.com/office/drawing/2010/main" val="0"/>
+                        </a:ext>
+                      </a:extLst>
+                    </a:blip>
                     <a:stretch>
                       <a:fillRect/>
                     </a:stretch>
@@ -3380,7 +3338,7 @@
                   <pic:spPr>
                     <a:xfrm>
                       <a:off x="0" y="0"/>
-                      <a:ext cx="5943600" cy="3791585"/>
+                      <a:ext cx="5101781" cy="5072773"/>
                     </a:xfrm>
                     <a:prstGeom prst="rect">
                       <a:avLst/>
@@ -3398,45 +3356,20 @@
         <w:pStyle w:val="BodyText"/>
       </w:pPr>
       <w:r>
-        <w:t>Fig 4: requireLogin and requireAdmin middleware functions in routes/dashboard.js enforcing role-based access control as a security layer within the Application Tier.</w:t>
-      </w:r>
-    </w:p>
-    <w:p>
-      <w:pPr>
-        <w:pStyle w:val="BodyText"/>
-        <w:rPr>
-          <w:b/>
-          <w:bCs/>
-        </w:rPr>
-      </w:pPr>
-      <w:r>
-        <w:rPr>
-          <w:b/>
-          <w:bCs/>
-        </w:rPr>
-        <w:t xml:space="preserve">Fig 5: </w:t>
-      </w:r>
-      <w:proofErr w:type="spellStart"/>
-      <w:r>
-        <w:rPr>
-          <w:b/>
-          <w:bCs/>
-        </w:rPr>
-        <w:t>SmartShop</w:t>
-      </w:r>
-      <w:proofErr w:type="spellEnd"/>
-      <w:r>
-        <w:rPr>
-          <w:b/>
-          <w:bCs/>
-        </w:rPr>
-        <w:t xml:space="preserve"> Running at localhost:3000</w:t>
-      </w:r>
-    </w:p>
-    <w:p>
-      <w:pPr>
-        <w:pStyle w:val="BodyText"/>
-      </w:pPr>
+        <w:t>Fig 1: phpMyAdmin showing the smartshop_db database with all four tables — users, products, orders, and order_items — confirming successful database creation and table structure.</w:t>
+      </w:r>
+    </w:p>
+    <w:p>
+      <w:pPr>
+        <w:pStyle w:val="BodyText"/>
+      </w:pPr>
+      <w:r>
+        <w:rPr>
+          <w:b/>
+          <w:bCs/>
+        </w:rPr>
+        <w:t>Fig 2: Add Product Form – Create Operation</w:t>
+      </w:r>
     </w:p>
     <w:p>
       <w:pPr>
@@ -3448,10 +3381,10 @@
         </w:rPr>
         <w:lastRenderedPageBreak/>
         <w:drawing>
-          <wp:inline distT="0" distB="0" distL="0" distR="0" wp14:anchorId="063E8472" wp14:editId="1E5AE7A3">
-            <wp:extent cx="5943600" cy="5978525"/>
+          <wp:inline distT="0" distB="0" distL="0" distR="0" wp14:anchorId="28E1C4C3" wp14:editId="2745D600">
+            <wp:extent cx="5233481" cy="5264792"/>
             <wp:effectExtent l="0" t="0" r="0" b="0"/>
-            <wp:docPr id="1512440220" name="Picture 1"/>
+            <wp:docPr id="1450719786" name="Picture 1"/>
             <wp:cNvGraphicFramePr>
               <a:graphicFrameLocks xmlns:a="http://schemas.openxmlformats.org/drawingml/2006/main" noChangeAspect="1"/>
             </wp:cNvGraphicFramePr>
@@ -3459,7 +3392,7 @@
               <a:graphicData uri="http://schemas.openxmlformats.org/drawingml/2006/picture">
                 <pic:pic xmlns:pic="http://schemas.openxmlformats.org/drawingml/2006/picture">
                   <pic:nvPicPr>
-                    <pic:cNvPr id="1512440220" name=""/>
+                    <pic:cNvPr id="1450719786" name=""/>
                     <pic:cNvPicPr/>
                   </pic:nvPicPr>
                   <pic:blipFill>
@@ -3471,7 +3404,7 @@
                   <pic:spPr>
                     <a:xfrm>
                       <a:off x="0" y="0"/>
-                      <a:ext cx="5943600" cy="5978525"/>
+                      <a:ext cx="5237297" cy="5268631"/>
                     </a:xfrm>
                     <a:prstGeom prst="rect">
                       <a:avLst/>
@@ -3489,79 +3422,19 @@
         <w:pStyle w:val="BodyText"/>
       </w:pPr>
       <w:r>
-        <w:t>Fig 5: SmartShop running successfully at localhost:3000 in the browser, demonstrating that all three tiers are communicating correctly in the local development environment.</w:t>
-      </w:r>
-    </w:p>
-    <w:p>
-      <w:pPr>
-        <w:pStyle w:val="BodyText"/>
-      </w:pPr>
-      <w:r>
-        <w:rPr>
-          <w:b/>
-          <w:bCs/>
-        </w:rPr>
-        <w:t xml:space="preserve">Student Reflection </w:t>
-      </w:r>
-    </w:p>
-    <w:p>
-      <w:pPr>
-        <w:pStyle w:val="BodyText"/>
-      </w:pPr>
-      <w:r>
-        <w:t xml:space="preserve">This week I focused on the architectural design of SmartShop using the N-Tier model. The Draw.io diagram in Fig 1 made it clear how the three layers communicate — the browser sends a request, Express routes it through the Application Tier, and MySQL responds with data before EJS renders the result back to the user. Fig 2 shows this separation physically in the folder structure, where views/, routes/, and config/ each represent a distinct tier. Fig 3 demonstrates the Application Tier in action through server.js middleware and route mounting. The security layer in Fig 4 sits within the Application Tier, ensuring </w:t>
-      </w:r>
-      <w:r>
-        <w:lastRenderedPageBreak/>
-        <w:t>unauthenticated users cannot access protected routes. Fig 5 confirms that the full three-tier system is operational. Understanding N-Tier architecture this week helped me see why separating concerns in code is important for both maintainability and security.</w:t>
-      </w:r>
-    </w:p>
-    <w:p>
-      <w:pPr>
-        <w:pStyle w:val="BodyText"/>
-        <w:pageBreakBefore/>
-      </w:pPr>
-    </w:p>
-    <w:p>
-      <w:pPr>
-        <w:pStyle w:val="Heading1"/>
-      </w:pPr>
-      <w:bookmarkStart w:id="13" w:name="_Toc233336143"/>
-      <w:r>
-        <w:t>WEEK 8: Object-Oriented Modelling – UML Diagrams</w:t>
-      </w:r>
-      <w:bookmarkEnd w:id="13"/>
-    </w:p>
-    <w:p>
-      <w:pPr>
-        <w:pStyle w:val="BodyText"/>
-      </w:pPr>
-      <w:r>
-        <w:rPr>
-          <w:b/>
-          <w:bCs/>
-        </w:rPr>
-        <w:t xml:space="preserve">Title: </w:t>
-      </w:r>
-      <w:r>
-        <w:t>Object-Oriented Modelling – UML Diagrams for SmartShop</w:t>
-      </w:r>
-    </w:p>
-    <w:p>
-      <w:pPr>
-        <w:pStyle w:val="BodyText"/>
-      </w:pPr>
-    </w:p>
-    <w:p>
-      <w:pPr>
-        <w:pStyle w:val="BodyText"/>
-      </w:pPr>
-      <w:r>
-        <w:rPr>
-          <w:b/>
-          <w:bCs/>
-        </w:rPr>
-        <w:t>Fig 1: Use Case Diagram – SmartShop System</w:t>
+        <w:t>Fig 2: Admin product creation form with fields for name, description, price, stock, category, and image URL — demonstrating the Create operation of the CRUD cycle in SmartShop.</w:t>
+      </w:r>
+    </w:p>
+    <w:p>
+      <w:pPr>
+        <w:pStyle w:val="BodyText"/>
+      </w:pPr>
+      <w:r>
+        <w:rPr>
+          <w:b/>
+          <w:bCs/>
+        </w:rPr>
+        <w:t>Fig 3: Products Table in phpMyAdmin After Adding a Product – Read Operation</w:t>
       </w:r>
     </w:p>
     <w:p>
@@ -3573,10 +3446,10 @@
           <w:noProof/>
         </w:rPr>
         <w:drawing>
-          <wp:inline distT="0" distB="0" distL="0" distR="0" wp14:anchorId="477784F6" wp14:editId="4F34A74F">
-            <wp:extent cx="3658111" cy="5487166"/>
+          <wp:inline distT="0" distB="0" distL="0" distR="0" wp14:anchorId="4264E672" wp14:editId="3FDA6795">
+            <wp:extent cx="5943600" cy="1138136"/>
             <wp:effectExtent l="0" t="0" r="0" b="0"/>
-            <wp:docPr id="2109965423" name="Picture 1"/>
+            <wp:docPr id="348978813" name="Picture 1"/>
             <wp:cNvGraphicFramePr>
               <a:graphicFrameLocks xmlns:a="http://schemas.openxmlformats.org/drawingml/2006/main" noChangeAspect="1"/>
             </wp:cNvGraphicFramePr>
@@ -3584,7 +3457,7 @@
               <a:graphicData uri="http://schemas.openxmlformats.org/drawingml/2006/picture">
                 <pic:pic xmlns:pic="http://schemas.openxmlformats.org/drawingml/2006/picture">
                   <pic:nvPicPr>
-                    <pic:cNvPr id="2109965423" name=""/>
+                    <pic:cNvPr id="348978813" name=""/>
                     <pic:cNvPicPr/>
                   </pic:nvPicPr>
                   <pic:blipFill>
@@ -3596,7 +3469,7 @@
                   <pic:spPr>
                     <a:xfrm>
                       <a:off x="0" y="0"/>
-                      <a:ext cx="3658111" cy="5487166"/>
+                      <a:ext cx="5971576" cy="1143493"/>
                     </a:xfrm>
                     <a:prstGeom prst="rect">
                       <a:avLst/>
@@ -3614,19 +3487,19 @@
         <w:pStyle w:val="BodyText"/>
       </w:pPr>
       <w:r>
-        <w:t>Fig 1: UML Use Case Diagram showing the two actors (Customer and Admin) and their interactions with the SmartShop system — including Register, Login, Browse Products, Place Order, Manage Products, and View Reports.</w:t>
-      </w:r>
-    </w:p>
-    <w:p>
-      <w:pPr>
-        <w:pStyle w:val="BodyText"/>
-      </w:pPr>
-      <w:r>
-        <w:rPr>
-          <w:b/>
-          <w:bCs/>
-        </w:rPr>
-        <w:t>Fig 2: Class Diagram – SmartShop Data Models</w:t>
+        <w:t>Fig 3: phpMyAdmin products table showing a newly added product as a row, confirming the INSERT SQL query executed successfully and the Read operation retrieves stored data correctly.</w:t>
+      </w:r>
+    </w:p>
+    <w:p>
+      <w:pPr>
+        <w:pStyle w:val="BodyText"/>
+      </w:pPr>
+      <w:r>
+        <w:rPr>
+          <w:b/>
+          <w:bCs/>
+        </w:rPr>
+        <w:t>Fig 4: Edit Product Form – Update Operation</w:t>
       </w:r>
     </w:p>
     <w:p>
@@ -3639,10 +3512,10 @@
         </w:rPr>
         <w:lastRenderedPageBreak/>
         <w:drawing>
-          <wp:inline distT="0" distB="0" distL="0" distR="0" wp14:anchorId="042262C4" wp14:editId="3633B393">
-            <wp:extent cx="4248743" cy="5344271"/>
-            <wp:effectExtent l="0" t="0" r="0" b="8890"/>
-            <wp:docPr id="754962022" name="Picture 1"/>
+          <wp:inline distT="0" distB="0" distL="0" distR="0" wp14:anchorId="4D06E066" wp14:editId="47BFFDE3">
+            <wp:extent cx="5943600" cy="2800985"/>
+            <wp:effectExtent l="0" t="0" r="0" b="0"/>
+            <wp:docPr id="314404359" name="Picture 1"/>
             <wp:cNvGraphicFramePr>
               <a:graphicFrameLocks xmlns:a="http://schemas.openxmlformats.org/drawingml/2006/main" noChangeAspect="1"/>
             </wp:cNvGraphicFramePr>
@@ -3650,7 +3523,7 @@
               <a:graphicData uri="http://schemas.openxmlformats.org/drawingml/2006/picture">
                 <pic:pic xmlns:pic="http://schemas.openxmlformats.org/drawingml/2006/picture">
                   <pic:nvPicPr>
-                    <pic:cNvPr id="754962022" name=""/>
+                    <pic:cNvPr id="314404359" name=""/>
                     <pic:cNvPicPr/>
                   </pic:nvPicPr>
                   <pic:blipFill>
@@ -3662,7 +3535,7 @@
                   <pic:spPr>
                     <a:xfrm>
                       <a:off x="0" y="0"/>
-                      <a:ext cx="4248743" cy="5344271"/>
+                      <a:ext cx="5943600" cy="2800985"/>
                     </a:xfrm>
                     <a:prstGeom prst="rect">
                       <a:avLst/>
@@ -3679,6 +3552,21 @@
       <w:pPr>
         <w:pStyle w:val="BodyText"/>
       </w:pPr>
+      <w:r>
+        <w:t>Fig 4: Admin edit product form pre-populated with existing product data, demonstrating the Update operation — changes submitted here execute an UPDATE SQL query against the products table.</w:t>
+      </w:r>
+    </w:p>
+    <w:p>
+      <w:pPr>
+        <w:pStyle w:val="BodyText"/>
+      </w:pPr>
+      <w:r>
+        <w:rPr>
+          <w:b/>
+          <w:bCs/>
+        </w:rPr>
+        <w:t>Fig 5: Admin Panel with Delete Button – Delete Operation</w:t>
+      </w:r>
     </w:p>
     <w:p>
       <w:pPr>
@@ -3688,12 +3576,11 @@
         <w:rPr>
           <w:noProof/>
         </w:rPr>
-        <w:lastRenderedPageBreak/>
         <w:drawing>
-          <wp:inline distT="0" distB="0" distL="0" distR="0" wp14:anchorId="7D195EB6" wp14:editId="5153729D">
-            <wp:extent cx="3362794" cy="5410955"/>
-            <wp:effectExtent l="0" t="0" r="9525" b="0"/>
-            <wp:docPr id="899440536" name="Picture 1"/>
+          <wp:inline distT="0" distB="0" distL="0" distR="0" wp14:anchorId="08087C96" wp14:editId="20475BF7">
+            <wp:extent cx="5943600" cy="2759710"/>
+            <wp:effectExtent l="0" t="0" r="0" b="0"/>
+            <wp:docPr id="1512812272" name="Picture 1"/>
             <wp:cNvGraphicFramePr>
               <a:graphicFrameLocks xmlns:a="http://schemas.openxmlformats.org/drawingml/2006/main" noChangeAspect="1"/>
             </wp:cNvGraphicFramePr>
@@ -3701,7 +3588,7 @@
               <a:graphicData uri="http://schemas.openxmlformats.org/drawingml/2006/picture">
                 <pic:pic xmlns:pic="http://schemas.openxmlformats.org/drawingml/2006/picture">
                   <pic:nvPicPr>
-                    <pic:cNvPr id="899440536" name=""/>
+                    <pic:cNvPr id="1512812272" name=""/>
                     <pic:cNvPicPr/>
                   </pic:nvPicPr>
                   <pic:blipFill>
@@ -3713,7 +3600,7 @@
                   <pic:spPr>
                     <a:xfrm>
                       <a:off x="0" y="0"/>
-                      <a:ext cx="3362794" cy="5410955"/>
+                      <a:ext cx="5943600" cy="2759710"/>
                     </a:xfrm>
                     <a:prstGeom prst="rect">
                       <a:avLst/>
@@ -3725,41 +3612,117 @@
           </wp:inline>
         </w:drawing>
       </w:r>
-      <w:r>
-        <w:pict w14:anchorId="152E1C59">
-          <v:rect id="AutoShape 2" o:spid="_x0000_s1027" style="width:23.6pt;height:23.6pt;visibility:visible;mso-wrap-style:square;mso-left-percent:-10001;mso-top-percent:-10001;mso-position-horizontal:absolute;mso-position-horizontal-relative:char;mso-position-vertical:absolute;mso-position-vertical-relative:line;mso-left-percent:-10001;mso-top-percent:-10001;v-text-anchor:top" filled="f" stroked="f">
-            <o:lock v:ext="edit" aspectratio="t"/>
-            <w10:anchorlock/>
-          </v:rect>
-        </w:pict>
-      </w:r>
-      <w:r>
-        <w:pict w14:anchorId="4C8AD6C9">
-          <v:rect id="AutoShape 1" o:spid="_x0000_s1026" style="width:23.6pt;height:23.6pt;visibility:visible;mso-wrap-style:square;mso-left-percent:-10001;mso-top-percent:-10001;mso-position-horizontal:absolute;mso-position-horizontal-relative:char;mso-position-vertical:absolute;mso-position-vertical-relative:line;mso-left-percent:-10001;mso-top-percent:-10001;v-text-anchor:top" filled="f" stroked="f">
-            <o:lock v:ext="edit" aspectratio="t"/>
-            <w10:anchorlock/>
-          </v:rect>
-        </w:pict>
-      </w:r>
-    </w:p>
-    <w:p>
-      <w:pPr>
-        <w:pStyle w:val="BodyText"/>
-      </w:pPr>
-      <w:r>
-        <w:t>Fig 2: UML Class Diagram mapping the four SmartShop database tables (User, Product, Order, OrderItem) as classes with their attributes and relationships — User places many Orders, Order contains many OrderItems, each linked to a Product.</w:t>
-      </w:r>
-    </w:p>
-    <w:p>
-      <w:pPr>
-        <w:pStyle w:val="BodyText"/>
-      </w:pPr>
-      <w:r>
-        <w:rPr>
-          <w:b/>
-          <w:bCs/>
-        </w:rPr>
-        <w:t>Fig 3: Sequence Diagram – User Login Flow</w:t>
+    </w:p>
+    <w:p>
+      <w:pPr>
+        <w:pStyle w:val="BodyText"/>
+      </w:pPr>
+      <w:r>
+        <w:t>Fig 5: Admin panel showing all products listed with Edit and Delete action buttons, completing the full CRUD cycle — clicking Delete triggers a POST request that executes a DELETE SQL query to remove the product from the database.</w:t>
+      </w:r>
+    </w:p>
+    <w:p>
+      <w:pPr>
+        <w:pStyle w:val="BodyText"/>
+      </w:pPr>
+      <w:r>
+        <w:rPr>
+          <w:b/>
+          <w:bCs/>
+        </w:rPr>
+        <w:t xml:space="preserve">Student Reflection </w:t>
+      </w:r>
+    </w:p>
+    <w:p>
+      <w:pPr>
+        <w:pStyle w:val="BodyText"/>
+      </w:pPr>
+      <w:r>
+        <w:t xml:space="preserve">This week I integrated the SmartShop application with a MySQL database and implemented full CRUD operations. Fig 1 shows smartshop_db in phpMyAdmin with all four tables that form the complete data structure for the system. The Create operation in Fig 2 uses an </w:t>
+      </w:r>
+      <w:r>
+        <w:lastRenderedPageBreak/>
+        <w:t>HTML form to collect product details which are then inserted into the products table using a parameterized INSERT query in routes/products.js — the result is immediately visible in Fig 3, confirming frontend and database are connected. The Update operation in Fig 4 pre-populates the edit form using a SELECT query and saves changes via an UPDATE query. Fig 5 shows the Delete operation completing the CRUD cycle — a POST form submits the product ID and the route executes a DELETE query. Using parameterized queries throughout prevents SQL injection, following industry best practices for database security.</w:t>
+      </w:r>
+    </w:p>
+    <w:p>
+      <w:pPr>
+        <w:pStyle w:val="BodyText"/>
+        <w:rPr>
+          <w:i/>
+          <w:iCs/>
+        </w:rPr>
+      </w:pPr>
+      <w:r>
+        <w:rPr>
+          <w:i/>
+          <w:iCs/>
+        </w:rPr>
+        <w:t>BIT3208 – Advanced Web Design and Development</w:t>
+      </w:r>
+    </w:p>
+    <w:p>
+      <w:pPr>
+        <w:pStyle w:val="BodyText"/>
+        <w:rPr>
+          <w:i/>
+          <w:iCs/>
+        </w:rPr>
+      </w:pPr>
+      <w:r>
+        <w:rPr>
+          <w:i/>
+          <w:iCs/>
+        </w:rPr>
+        <w:t>Student: Marciah Muringi Gichohi | Admission No: BSCCS/2024/53659</w:t>
+      </w:r>
+    </w:p>
+    <w:p>
+      <w:pPr>
+        <w:pStyle w:val="BodyText"/>
+      </w:pPr>
+    </w:p>
+    <w:p>
+      <w:pPr>
+        <w:pStyle w:val="BodyText"/>
+        <w:rPr>
+          <w:b/>
+          <w:bCs/>
+        </w:rPr>
+      </w:pPr>
+      <w:r>
+        <w:rPr>
+          <w:b/>
+          <w:bCs/>
+        </w:rPr>
+        <w:t>WEEK 7: User Authentication and Session Management</w:t>
+      </w:r>
+    </w:p>
+    <w:p>
+      <w:pPr>
+        <w:pStyle w:val="BodyText"/>
+      </w:pPr>
+      <w:r>
+        <w:rPr>
+          <w:b/>
+          <w:bCs/>
+        </w:rPr>
+        <w:t xml:space="preserve">Title: </w:t>
+      </w:r>
+      <w:r>
+        <w:t>Secure Login, Registration, and Session Management in SmartShop</w:t>
+      </w:r>
+    </w:p>
+    <w:p>
+      <w:pPr>
+        <w:pStyle w:val="BodyText"/>
+      </w:pPr>
+      <w:r>
+        <w:rPr>
+          <w:b/>
+          <w:bCs/>
+        </w:rPr>
+        <w:t>Fig 1: User Registration Form</w:t>
       </w:r>
     </w:p>
     <w:p>
@@ -3770,12 +3733,11 @@
         <w:rPr>
           <w:noProof/>
         </w:rPr>
-        <w:lastRenderedPageBreak/>
         <w:drawing>
-          <wp:inline distT="0" distB="0" distL="0" distR="0" wp14:anchorId="7A395F47" wp14:editId="06091371">
-            <wp:extent cx="5106113" cy="3648584"/>
-            <wp:effectExtent l="0" t="0" r="0" b="9525"/>
-            <wp:docPr id="2117880859" name="Picture 1"/>
+          <wp:inline distT="0" distB="0" distL="0" distR="0" wp14:anchorId="67B9262D" wp14:editId="26E725CC">
+            <wp:extent cx="5943600" cy="2801620"/>
+            <wp:effectExtent l="0" t="0" r="0" b="0"/>
+            <wp:docPr id="1939839500" name="Picture 1"/>
             <wp:cNvGraphicFramePr>
               <a:graphicFrameLocks xmlns:a="http://schemas.openxmlformats.org/drawingml/2006/main" noChangeAspect="1"/>
             </wp:cNvGraphicFramePr>
@@ -3783,7 +3745,7 @@
               <a:graphicData uri="http://schemas.openxmlformats.org/drawingml/2006/picture">
                 <pic:pic xmlns:pic="http://schemas.openxmlformats.org/drawingml/2006/picture">
                   <pic:nvPicPr>
-                    <pic:cNvPr id="2117880859" name=""/>
+                    <pic:cNvPr id="1939839500" name=""/>
                     <pic:cNvPicPr/>
                   </pic:nvPicPr>
                   <pic:blipFill>
@@ -3795,7 +3757,7 @@
                   <pic:spPr>
                     <a:xfrm>
                       <a:off x="0" y="0"/>
-                      <a:ext cx="5106113" cy="3648584"/>
+                      <a:ext cx="5943600" cy="2801620"/>
                     </a:xfrm>
                     <a:prstGeom prst="rect">
                       <a:avLst/>
@@ -3813,19 +3775,37 @@
         <w:pStyle w:val="BodyText"/>
       </w:pPr>
       <w:r>
-        <w:t>Fig 3: UML Sequence Diagram showing the message flow during user login — from the browser submitting credentials, through the Express route, bcrypt password comparison, session creation, and final redirect to the dashboard.</w:t>
-      </w:r>
-    </w:p>
-    <w:p>
-      <w:pPr>
-        <w:pStyle w:val="BodyText"/>
-      </w:pPr>
-      <w:r>
-        <w:rPr>
-          <w:b/>
-          <w:bCs/>
-        </w:rPr>
-        <w:t>Fig 4: Activity Diagram – Place Order Process</w:t>
+        <w:t>Fig 1: SmartShop user registration form collecting name, email, password, and confirm password — form validation runs client-side before data is submitted to routes/auth.js for server-side processing.</w:t>
+      </w:r>
+    </w:p>
+    <w:p>
+      <w:pPr>
+        <w:pStyle w:val="BodyText"/>
+        <w:rPr>
+          <w:b/>
+          <w:bCs/>
+        </w:rPr>
+      </w:pPr>
+    </w:p>
+    <w:p>
+      <w:pPr>
+        <w:pStyle w:val="BodyText"/>
+        <w:rPr>
+          <w:b/>
+          <w:bCs/>
+        </w:rPr>
+      </w:pPr>
+    </w:p>
+    <w:p>
+      <w:pPr>
+        <w:pStyle w:val="BodyText"/>
+      </w:pPr>
+      <w:r>
+        <w:rPr>
+          <w:b/>
+          <w:bCs/>
+        </w:rPr>
+        <w:t>Fig 2: Hashed Password Stored in Database</w:t>
       </w:r>
     </w:p>
     <w:p>
@@ -3838,10 +3818,10 @@
         </w:rPr>
         <w:lastRenderedPageBreak/>
         <w:drawing>
-          <wp:inline distT="0" distB="0" distL="0" distR="0" wp14:anchorId="03A56966" wp14:editId="7BC930BD">
-            <wp:extent cx="3686689" cy="5201376"/>
-            <wp:effectExtent l="0" t="0" r="9525" b="0"/>
-            <wp:docPr id="1621689258" name="Picture 1"/>
+          <wp:inline distT="0" distB="0" distL="0" distR="0" wp14:anchorId="7892A383" wp14:editId="49225587">
+            <wp:extent cx="5749282" cy="2266544"/>
+            <wp:effectExtent l="0" t="0" r="0" b="0"/>
+            <wp:docPr id="1372448353" name="Picture 1"/>
             <wp:cNvGraphicFramePr>
               <a:graphicFrameLocks xmlns:a="http://schemas.openxmlformats.org/drawingml/2006/main" noChangeAspect="1"/>
             </wp:cNvGraphicFramePr>
@@ -3849,7 +3829,7 @@
               <a:graphicData uri="http://schemas.openxmlformats.org/drawingml/2006/picture">
                 <pic:pic xmlns:pic="http://schemas.openxmlformats.org/drawingml/2006/picture">
                   <pic:nvPicPr>
-                    <pic:cNvPr id="1621689258" name=""/>
+                    <pic:cNvPr id="1372448353" name=""/>
                     <pic:cNvPicPr/>
                   </pic:nvPicPr>
                   <pic:blipFill>
@@ -3861,7 +3841,7 @@
                   <pic:spPr>
                     <a:xfrm>
                       <a:off x="0" y="0"/>
-                      <a:ext cx="3686689" cy="5201376"/>
+                      <a:ext cx="5754048" cy="2268423"/>
                     </a:xfrm>
                     <a:prstGeom prst="rect">
                       <a:avLst/>
@@ -3879,19 +3859,19 @@
         <w:pStyle w:val="BodyText"/>
       </w:pPr>
       <w:r>
-        <w:t>Fig 4: UML Activity Diagram illustrating the steps a customer follows to place an order — Browse Products, Select Product, Login Check, Confirm Order, Save to Database, and View Confirmation.</w:t>
-      </w:r>
-    </w:p>
-    <w:p>
-      <w:pPr>
-        <w:pStyle w:val="BodyText"/>
-      </w:pPr>
-      <w:r>
-        <w:rPr>
-          <w:b/>
-          <w:bCs/>
-        </w:rPr>
-        <w:t>Fig 5: Draw.io UML Workspace Showing All Diagrams</w:t>
+        <w:t>Fig 2: phpMyAdmin users table showing a registered user with their password stored as a bcrypt hash starting with $2b$ — confirming plain text passwords are never saved to the database.</w:t>
+      </w:r>
+    </w:p>
+    <w:p>
+      <w:pPr>
+        <w:pStyle w:val="BodyText"/>
+      </w:pPr>
+      <w:r>
+        <w:rPr>
+          <w:b/>
+          <w:bCs/>
+        </w:rPr>
+        <w:t>Fig 3: Login Form and Authentication Route</w:t>
       </w:r>
     </w:p>
     <w:p>
@@ -3902,12 +3882,11 @@
         <w:rPr>
           <w:noProof/>
         </w:rPr>
-        <w:lastRenderedPageBreak/>
         <w:drawing>
-          <wp:inline distT="0" distB="0" distL="0" distR="0" wp14:anchorId="1F79197B" wp14:editId="1FDF5B29">
-            <wp:extent cx="5943600" cy="5028565"/>
+          <wp:inline distT="0" distB="0" distL="0" distR="0" wp14:anchorId="2391BBC3" wp14:editId="35D1B9FD">
+            <wp:extent cx="5488245" cy="2966936"/>
             <wp:effectExtent l="0" t="0" r="0" b="0"/>
-            <wp:docPr id="379001631" name="Picture 1"/>
+            <wp:docPr id="1947425925" name="Picture 1"/>
             <wp:cNvGraphicFramePr>
               <a:graphicFrameLocks xmlns:a="http://schemas.openxmlformats.org/drawingml/2006/main" noChangeAspect="1"/>
             </wp:cNvGraphicFramePr>
@@ -3915,7 +3894,7 @@
               <a:graphicData uri="http://schemas.openxmlformats.org/drawingml/2006/picture">
                 <pic:pic xmlns:pic="http://schemas.openxmlformats.org/drawingml/2006/picture">
                   <pic:nvPicPr>
-                    <pic:cNvPr id="379001631" name=""/>
+                    <pic:cNvPr id="1947425925" name=""/>
                     <pic:cNvPicPr/>
                   </pic:nvPicPr>
                   <pic:blipFill>
@@ -3927,7 +3906,7 @@
                   <pic:spPr>
                     <a:xfrm>
                       <a:off x="0" y="0"/>
-                      <a:ext cx="5943600" cy="5028565"/>
+                      <a:ext cx="5496555" cy="2971428"/>
                     </a:xfrm>
                     <a:prstGeom prst="rect">
                       <a:avLst/>
@@ -3945,15 +3924,1128 @@
         <w:pStyle w:val="BodyText"/>
       </w:pPr>
       <w:r>
-        <w:t xml:space="preserve">Fig 5: Draw.io workspace showing all four UML diagrams (Use Case, Class, Sequence, Activity) created for the SmartShop system, saved as </w:t>
+        <w:t>Fig 3: SmartShop login form alongside the routes/auth.js login handler — the route retrieves the user by email, uses bcrypt.compare() to verify the password hash, and saves the user object to a server-side session on success.</w:t>
+      </w:r>
+    </w:p>
+    <w:p>
+      <w:pPr>
+        <w:pStyle w:val="BodyText"/>
+        <w:rPr>
+          <w:b/>
+          <w:bCs/>
+        </w:rPr>
+      </w:pPr>
+    </w:p>
+    <w:p>
+      <w:pPr>
+        <w:pStyle w:val="BodyText"/>
+        <w:rPr>
+          <w:b/>
+          <w:bCs/>
+        </w:rPr>
+      </w:pPr>
+    </w:p>
+    <w:p>
+      <w:pPr>
+        <w:pStyle w:val="BodyText"/>
+      </w:pPr>
+      <w:r>
+        <w:rPr>
+          <w:b/>
+          <w:bCs/>
+        </w:rPr>
+        <w:t>Fig 4: Session Configuration and requireLogin Middleware</w:t>
+      </w:r>
+    </w:p>
+    <w:p>
+      <w:pPr>
+        <w:pStyle w:val="BodyText"/>
+      </w:pPr>
+      <w:r>
+        <w:rPr>
+          <w:noProof/>
+        </w:rPr>
+        <w:lastRenderedPageBreak/>
+        <w:drawing>
+          <wp:inline distT="0" distB="0" distL="0" distR="0" wp14:anchorId="7DA777EA" wp14:editId="0365E50C">
+            <wp:extent cx="5696129" cy="1906621"/>
+            <wp:effectExtent l="0" t="0" r="0" b="0"/>
+            <wp:docPr id="778028255" name="Picture 1"/>
+            <wp:cNvGraphicFramePr>
+              <a:graphicFrameLocks xmlns:a="http://schemas.openxmlformats.org/drawingml/2006/main" noChangeAspect="1"/>
+            </wp:cNvGraphicFramePr>
+            <a:graphic xmlns:a="http://schemas.openxmlformats.org/drawingml/2006/main">
+              <a:graphicData uri="http://schemas.openxmlformats.org/drawingml/2006/picture">
+                <pic:pic xmlns:pic="http://schemas.openxmlformats.org/drawingml/2006/picture">
+                  <pic:nvPicPr>
+                    <pic:cNvPr id="778028255" name=""/>
+                    <pic:cNvPicPr/>
+                  </pic:nvPicPr>
+                  <pic:blipFill>
+                    <a:blip r:embed="rId44"/>
+                    <a:stretch>
+                      <a:fillRect/>
+                    </a:stretch>
+                  </pic:blipFill>
+                  <pic:spPr>
+                    <a:xfrm>
+                      <a:off x="0" y="0"/>
+                      <a:ext cx="5702595" cy="1908785"/>
+                    </a:xfrm>
+                    <a:prstGeom prst="rect">
+                      <a:avLst/>
+                    </a:prstGeom>
+                  </pic:spPr>
+                </pic:pic>
+              </a:graphicData>
+            </a:graphic>
+          </wp:inline>
+        </w:drawing>
+      </w:r>
+    </w:p>
+    <w:p>
+      <w:pPr>
+        <w:pStyle w:val="BodyText"/>
+      </w:pPr>
+    </w:p>
+    <w:p>
+      <w:pPr>
+        <w:pStyle w:val="BodyText"/>
+      </w:pPr>
+    </w:p>
+    <w:p>
+      <w:pPr>
+        <w:pStyle w:val="BodyText"/>
+      </w:pPr>
+      <w:r>
+        <w:t>Fig 4: Session setup in server.js using express-session with server-side storage, alongside the requireLogin and requireAdmin middleware functions in routes/dashboard.js that restrict access to protected pages based on session data.</w:t>
+      </w:r>
+    </w:p>
+    <w:p>
+      <w:pPr>
+        <w:pStyle w:val="BodyText"/>
+      </w:pPr>
+      <w:r>
+        <w:rPr>
+          <w:b/>
+          <w:bCs/>
+        </w:rPr>
+        <w:t>Fig 5: Protected Dashboard After Successful Login</w:t>
+      </w:r>
+    </w:p>
+    <w:p>
+      <w:pPr>
+        <w:pStyle w:val="BodyText"/>
+      </w:pPr>
+      <w:r>
+        <w:rPr>
+          <w:noProof/>
+        </w:rPr>
+        <w:drawing>
+          <wp:inline distT="0" distB="0" distL="0" distR="0" wp14:anchorId="63D92DCC" wp14:editId="086717A7">
+            <wp:extent cx="5398851" cy="2330850"/>
+            <wp:effectExtent l="0" t="0" r="0" b="0"/>
+            <wp:docPr id="351994559" name="Picture 1"/>
+            <wp:cNvGraphicFramePr>
+              <a:graphicFrameLocks xmlns:a="http://schemas.openxmlformats.org/drawingml/2006/main" noChangeAspect="1"/>
+            </wp:cNvGraphicFramePr>
+            <a:graphic xmlns:a="http://schemas.openxmlformats.org/drawingml/2006/main">
+              <a:graphicData uri="http://schemas.openxmlformats.org/drawingml/2006/picture">
+                <pic:pic xmlns:pic="http://schemas.openxmlformats.org/drawingml/2006/picture">
+                  <pic:nvPicPr>
+                    <pic:cNvPr id="351994559" name=""/>
+                    <pic:cNvPicPr/>
+                  </pic:nvPicPr>
+                  <pic:blipFill>
+                    <a:blip r:embed="rId45"/>
+                    <a:stretch>
+                      <a:fillRect/>
+                    </a:stretch>
+                  </pic:blipFill>
+                  <pic:spPr>
+                    <a:xfrm>
+                      <a:off x="0" y="0"/>
+                      <a:ext cx="5413592" cy="2337214"/>
+                    </a:xfrm>
+                    <a:prstGeom prst="rect">
+                      <a:avLst/>
+                    </a:prstGeom>
+                  </pic:spPr>
+                </pic:pic>
+              </a:graphicData>
+            </a:graphic>
+          </wp:inline>
+        </w:drawing>
+      </w:r>
+    </w:p>
+    <w:p>
+      <w:pPr>
+        <w:pStyle w:val="BodyText"/>
+      </w:pPr>
+      <w:r>
+        <w:t>Fig 5: SmartShop customer dashboard displayed after a successful login, showing the logged-in user's name and personalized content — confirming session-based authentication is working and unauthorized access is blocked.</w:t>
+      </w:r>
+    </w:p>
+    <w:p>
+      <w:pPr>
+        <w:pStyle w:val="BodyText"/>
+      </w:pPr>
+      <w:r>
+        <w:rPr>
+          <w:b/>
+          <w:bCs/>
+        </w:rPr>
+        <w:t xml:space="preserve">Student Reflection </w:t>
+      </w:r>
+    </w:p>
+    <w:p>
+      <w:pPr>
+        <w:pStyle w:val="BodyText"/>
+      </w:pPr>
+      <w:r>
+        <w:t xml:space="preserve">This week I built the complete user authentication system for SmartShop. The registration form in Fig 1 collects user credentials which are processed in routes/auth.js — before saving, bcryptjs hashes the password as shown in Fig 2, ensuring that even if the database were compromised, passwords remain unreadable. The login system in Fig 3 uses bcrypt.compare() to verify submitted passwords against stored hashes without ever decrypting them, which is the industry-standard approach. Session management in Fig 4 uses express-session with server-side storage — only a session ID cookie reaches the </w:t>
+      </w:r>
+      <w:r>
+        <w:lastRenderedPageBreak/>
+        <w:t>browser, keeping sensitive user data secure on the server. The requireLogin and requireAdmin middleware functions gate access to protected routes, redirecting unauthenticated users back to the login page. Fig 5 confirms the complete flow works — a successful login creates a session and renders the personalized dashboard. This week demonstrated how authentication, hashing, and sessions work together to create a secure multi-user web application.</w:t>
+      </w:r>
+    </w:p>
+    <w:p>
+      <w:pPr>
+        <w:pStyle w:val="BodyText"/>
+        <w:rPr>
+          <w:i/>
+          <w:iCs/>
+        </w:rPr>
+      </w:pPr>
+      <w:r>
+        <w:rPr>
+          <w:i/>
+          <w:iCs/>
+        </w:rPr>
+        <w:t>BIT3208 – Advanced Web Design and Development</w:t>
+      </w:r>
+    </w:p>
+    <w:p>
+      <w:pPr>
+        <w:pStyle w:val="BodyText"/>
+        <w:rPr>
+          <w:i/>
+          <w:iCs/>
+        </w:rPr>
+      </w:pPr>
+      <w:r>
+        <w:rPr>
+          <w:i/>
+          <w:iCs/>
+        </w:rPr>
+        <w:t>Student: Marciah Muringi Gichohi | Admission No: BSCCS/2024/53659</w:t>
+      </w:r>
+    </w:p>
+    <w:p>
+      <w:pPr>
+        <w:pStyle w:val="BodyText"/>
+      </w:pPr>
+    </w:p>
+    <w:p>
+      <w:pPr>
+        <w:pStyle w:val="BodyText"/>
+        <w:rPr>
+          <w:b/>
+          <w:bCs/>
+        </w:rPr>
+      </w:pPr>
+      <w:r>
+        <w:rPr>
+          <w:b/>
+          <w:bCs/>
+        </w:rPr>
+        <w:t>WEEK 8: Responsive Web Design and Mobile-First Development</w:t>
+      </w:r>
+    </w:p>
+    <w:p>
+      <w:pPr>
+        <w:pStyle w:val="BodyText"/>
+      </w:pPr>
+      <w:r>
+        <w:rPr>
+          <w:b/>
+          <w:bCs/>
+        </w:rPr>
+        <w:t xml:space="preserve">Title: </w:t>
+      </w:r>
+      <w:r>
+        <w:t>Responsive Design and Mobile-First Layout in SmartShop</w:t>
+      </w:r>
+    </w:p>
+    <w:p>
+      <w:pPr>
+        <w:pStyle w:val="BodyText"/>
+      </w:pPr>
+      <w:r>
+        <w:rPr>
+          <w:b/>
+          <w:bCs/>
+        </w:rPr>
+        <w:t>Fig 1: SmartShop Home Page on Desktop View</w:t>
+      </w:r>
+    </w:p>
+    <w:p>
+      <w:pPr>
+        <w:pStyle w:val="BodyText"/>
+      </w:pPr>
+      <w:r>
+        <w:rPr>
+          <w:noProof/>
+        </w:rPr>
+        <w:drawing>
+          <wp:inline distT="0" distB="0" distL="0" distR="0" wp14:anchorId="292E7A7D" wp14:editId="304E913A">
+            <wp:extent cx="5256343" cy="2597285"/>
+            <wp:effectExtent l="0" t="0" r="0" b="0"/>
+            <wp:docPr id="756587668" name="Picture 1"/>
+            <wp:cNvGraphicFramePr>
+              <a:graphicFrameLocks xmlns:a="http://schemas.openxmlformats.org/drawingml/2006/main" noChangeAspect="1"/>
+            </wp:cNvGraphicFramePr>
+            <a:graphic xmlns:a="http://schemas.openxmlformats.org/drawingml/2006/main">
+              <a:graphicData uri="http://schemas.openxmlformats.org/drawingml/2006/picture">
+                <pic:pic xmlns:pic="http://schemas.openxmlformats.org/drawingml/2006/picture">
+                  <pic:nvPicPr>
+                    <pic:cNvPr id="756587668" name=""/>
+                    <pic:cNvPicPr/>
+                  </pic:nvPicPr>
+                  <pic:blipFill>
+                    <a:blip r:embed="rId46"/>
+                    <a:stretch>
+                      <a:fillRect/>
+                    </a:stretch>
+                  </pic:blipFill>
+                  <pic:spPr>
+                    <a:xfrm>
+                      <a:off x="0" y="0"/>
+                      <a:ext cx="5266060" cy="2602086"/>
+                    </a:xfrm>
+                    <a:prstGeom prst="rect">
+                      <a:avLst/>
+                    </a:prstGeom>
+                  </pic:spPr>
+                </pic:pic>
+              </a:graphicData>
+            </a:graphic>
+          </wp:inline>
+        </w:drawing>
+      </w:r>
+    </w:p>
+    <w:p>
+      <w:pPr>
+        <w:pStyle w:val="BodyText"/>
+      </w:pPr>
+      <w:r>
+        <w:t>Fig 1: SmartShop home page displayed on a desktop browser showing the full-width hero section and multi-column product grid layout, demonstrating how CSS Grid arranges content on wider screens.</w:t>
+      </w:r>
+    </w:p>
+    <w:p>
+      <w:pPr>
+        <w:pStyle w:val="BodyText"/>
+        <w:rPr>
+          <w:b/>
+          <w:bCs/>
+        </w:rPr>
+      </w:pPr>
+    </w:p>
+    <w:p>
+      <w:pPr>
+        <w:pStyle w:val="BodyText"/>
+        <w:rPr>
+          <w:b/>
+          <w:bCs/>
+        </w:rPr>
+      </w:pPr>
+    </w:p>
+    <w:p>
+      <w:pPr>
+        <w:pStyle w:val="BodyText"/>
+        <w:rPr>
+          <w:b/>
+          <w:bCs/>
+        </w:rPr>
+      </w:pPr>
+    </w:p>
+    <w:p>
+      <w:pPr>
+        <w:pStyle w:val="BodyText"/>
+      </w:pPr>
+      <w:r>
+        <w:rPr>
+          <w:b/>
+          <w:bCs/>
+        </w:rPr>
+        <w:t>Fig 2: SmartShop on Mobile View Using Chrome DevTools</w:t>
+      </w:r>
+    </w:p>
+    <w:p>
+      <w:pPr>
+        <w:pStyle w:val="BodyText"/>
+      </w:pPr>
+      <w:r>
+        <w:rPr>
+          <w:noProof/>
+        </w:rPr>
+        <w:lastRenderedPageBreak/>
+        <w:drawing>
+          <wp:inline distT="0" distB="0" distL="0" distR="0" wp14:anchorId="07EEE1DF" wp14:editId="6F5A892B">
+            <wp:extent cx="4017523" cy="3241634"/>
+            <wp:effectExtent l="0" t="0" r="0" b="0"/>
+            <wp:docPr id="1737425306" name="Picture 1"/>
+            <wp:cNvGraphicFramePr>
+              <a:graphicFrameLocks xmlns:a="http://schemas.openxmlformats.org/drawingml/2006/main" noChangeAspect="1"/>
+            </wp:cNvGraphicFramePr>
+            <a:graphic xmlns:a="http://schemas.openxmlformats.org/drawingml/2006/main">
+              <a:graphicData uri="http://schemas.openxmlformats.org/drawingml/2006/picture">
+                <pic:pic xmlns:pic="http://schemas.openxmlformats.org/drawingml/2006/picture">
+                  <pic:nvPicPr>
+                    <pic:cNvPr id="1737425306" name=""/>
+                    <pic:cNvPicPr/>
+                  </pic:nvPicPr>
+                  <pic:blipFill>
+                    <a:blip r:embed="rId47"/>
+                    <a:stretch>
+                      <a:fillRect/>
+                    </a:stretch>
+                  </pic:blipFill>
+                  <pic:spPr>
+                    <a:xfrm>
+                      <a:off x="0" y="0"/>
+                      <a:ext cx="4039480" cy="3259350"/>
+                    </a:xfrm>
+                    <a:prstGeom prst="rect">
+                      <a:avLst/>
+                    </a:prstGeom>
+                  </pic:spPr>
+                </pic:pic>
+              </a:graphicData>
+            </a:graphic>
+          </wp:inline>
+        </w:drawing>
+      </w:r>
+    </w:p>
+    <w:p>
+      <w:pPr>
+        <w:pStyle w:val="BodyText"/>
+      </w:pPr>
+      <w:r>
+        <w:t>Fig 2: SmartShop home page simulated on a mobile screen using Chrome Developer Tools Device Toolbar (F12), showing the single-column layout that activates when the screen width drops below 768px.</w:t>
+      </w:r>
+    </w:p>
+    <w:p>
+      <w:pPr>
+        <w:pStyle w:val="BodyText"/>
+      </w:pPr>
+      <w:r>
+        <w:rPr>
+          <w:b/>
+          <w:bCs/>
+        </w:rPr>
+        <w:t>Fig 3: CSS Media Queries and Responsive Stylesheet</w:t>
+      </w:r>
+    </w:p>
+    <w:p>
+      <w:pPr>
+        <w:pStyle w:val="BodyText"/>
+      </w:pPr>
+      <w:r>
+        <w:rPr>
+          <w:noProof/>
+        </w:rPr>
+        <w:drawing>
+          <wp:inline distT="0" distB="0" distL="0" distR="0" wp14:anchorId="1A35DF75" wp14:editId="66242DBF">
+            <wp:extent cx="5330757" cy="2561155"/>
+            <wp:effectExtent l="0" t="0" r="0" b="0"/>
+            <wp:docPr id="1653801939" name="Picture 1"/>
+            <wp:cNvGraphicFramePr>
+              <a:graphicFrameLocks xmlns:a="http://schemas.openxmlformats.org/drawingml/2006/main" noChangeAspect="1"/>
+            </wp:cNvGraphicFramePr>
+            <a:graphic xmlns:a="http://schemas.openxmlformats.org/drawingml/2006/main">
+              <a:graphicData uri="http://schemas.openxmlformats.org/drawingml/2006/picture">
+                <pic:pic xmlns:pic="http://schemas.openxmlformats.org/drawingml/2006/picture">
+                  <pic:nvPicPr>
+                    <pic:cNvPr id="1653801939" name=""/>
+                    <pic:cNvPicPr/>
+                  </pic:nvPicPr>
+                  <pic:blipFill>
+                    <a:blip r:embed="rId48"/>
+                    <a:stretch>
+                      <a:fillRect/>
+                    </a:stretch>
+                  </pic:blipFill>
+                  <pic:spPr>
+                    <a:xfrm>
+                      <a:off x="0" y="0"/>
+                      <a:ext cx="5344937" cy="2567968"/>
+                    </a:xfrm>
+                    <a:prstGeom prst="rect">
+                      <a:avLst/>
+                    </a:prstGeom>
+                  </pic:spPr>
+                </pic:pic>
+              </a:graphicData>
+            </a:graphic>
+          </wp:inline>
+        </w:drawing>
+      </w:r>
+    </w:p>
+    <w:p>
+      <w:pPr>
+        <w:pStyle w:val="BodyText"/>
+      </w:pPr>
+      <w:r>
+        <w:t>Fig 3: SmartShop public/style.css showing media query breakpoints at 768px and 480px that change the product grid from multiple columns on desktop to a single column on mobile devices.</w:t>
+      </w:r>
+    </w:p>
+    <w:p>
+      <w:pPr>
+        <w:pStyle w:val="BodyText"/>
+        <w:rPr>
+          <w:b/>
+          <w:bCs/>
+        </w:rPr>
+      </w:pPr>
+    </w:p>
+    <w:p>
+      <w:pPr>
+        <w:pStyle w:val="BodyText"/>
+        <w:rPr>
+          <w:b/>
+          <w:bCs/>
+        </w:rPr>
+      </w:pPr>
+    </w:p>
+    <w:p>
+      <w:pPr>
+        <w:pStyle w:val="BodyText"/>
+      </w:pPr>
+      <w:r>
+        <w:rPr>
+          <w:b/>
+          <w:bCs/>
+        </w:rPr>
+        <w:lastRenderedPageBreak/>
+        <w:t>Fig 4: Viewport Meta Tag and Responsive Navigation</w:t>
+      </w:r>
+    </w:p>
+    <w:p>
+      <w:pPr>
+        <w:pStyle w:val="BodyText"/>
+      </w:pPr>
+      <w:r>
+        <w:rPr>
+          <w:noProof/>
+        </w:rPr>
+        <w:drawing>
+          <wp:inline distT="0" distB="0" distL="0" distR="0" wp14:anchorId="0EAC571C" wp14:editId="78105AB4">
+            <wp:extent cx="5359940" cy="3552106"/>
+            <wp:effectExtent l="0" t="0" r="0" b="0"/>
+            <wp:docPr id="268877041" name="Picture 1"/>
+            <wp:cNvGraphicFramePr>
+              <a:graphicFrameLocks xmlns:a="http://schemas.openxmlformats.org/drawingml/2006/main" noChangeAspect="1"/>
+            </wp:cNvGraphicFramePr>
+            <a:graphic xmlns:a="http://schemas.openxmlformats.org/drawingml/2006/main">
+              <a:graphicData uri="http://schemas.openxmlformats.org/drawingml/2006/picture">
+                <pic:pic xmlns:pic="http://schemas.openxmlformats.org/drawingml/2006/picture">
+                  <pic:nvPicPr>
+                    <pic:cNvPr id="268877041" name=""/>
+                    <pic:cNvPicPr/>
+                  </pic:nvPicPr>
+                  <pic:blipFill>
+                    <a:blip r:embed="rId49"/>
+                    <a:stretch>
+                      <a:fillRect/>
+                    </a:stretch>
+                  </pic:blipFill>
+                  <pic:spPr>
+                    <a:xfrm>
+                      <a:off x="0" y="0"/>
+                      <a:ext cx="5371721" cy="3559913"/>
+                    </a:xfrm>
+                    <a:prstGeom prst="rect">
+                      <a:avLst/>
+                    </a:prstGeom>
+                  </pic:spPr>
+                </pic:pic>
+              </a:graphicData>
+            </a:graphic>
+          </wp:inline>
+        </w:drawing>
+      </w:r>
+    </w:p>
+    <w:p>
+      <w:pPr>
+        <w:pStyle w:val="BodyText"/>
+      </w:pPr>
+      <w:r>
+        <w:t>Fig 4: SmartShop partials/header.ejs showing the viewport meta tag set to width=device-width and the navigation bar that collapses responsively on smaller screens using Flexbox.</w:t>
+      </w:r>
+    </w:p>
+    <w:p>
+      <w:pPr>
+        <w:pStyle w:val="BodyText"/>
+      </w:pPr>
+      <w:r>
+        <w:rPr>
+          <w:b/>
+          <w:bCs/>
+        </w:rPr>
+        <w:t>Fig 5: Product Cards on Tablet View</w:t>
+      </w:r>
+    </w:p>
+    <w:p>
+      <w:pPr>
+        <w:pStyle w:val="BodyText"/>
+      </w:pPr>
+      <w:r>
+        <w:rPr>
+          <w:noProof/>
+        </w:rPr>
+        <w:drawing>
+          <wp:inline distT="0" distB="0" distL="0" distR="0" wp14:anchorId="0938A467" wp14:editId="2A634CE2">
+            <wp:extent cx="5369668" cy="2696881"/>
+            <wp:effectExtent l="0" t="0" r="0" b="0"/>
+            <wp:docPr id="1087067224" name="Picture 1"/>
+            <wp:cNvGraphicFramePr>
+              <a:graphicFrameLocks xmlns:a="http://schemas.openxmlformats.org/drawingml/2006/main" noChangeAspect="1"/>
+            </wp:cNvGraphicFramePr>
+            <a:graphic xmlns:a="http://schemas.openxmlformats.org/drawingml/2006/main">
+              <a:graphicData uri="http://schemas.openxmlformats.org/drawingml/2006/picture">
+                <pic:pic xmlns:pic="http://schemas.openxmlformats.org/drawingml/2006/picture">
+                  <pic:nvPicPr>
+                    <pic:cNvPr id="1087067224" name=""/>
+                    <pic:cNvPicPr/>
+                  </pic:nvPicPr>
+                  <pic:blipFill>
+                    <a:blip r:embed="rId50"/>
+                    <a:stretch>
+                      <a:fillRect/>
+                    </a:stretch>
+                  </pic:blipFill>
+                  <pic:spPr>
+                    <a:xfrm>
+                      <a:off x="0" y="0"/>
+                      <a:ext cx="5369668" cy="2696881"/>
+                    </a:xfrm>
+                    <a:prstGeom prst="rect">
+                      <a:avLst/>
+                    </a:prstGeom>
+                  </pic:spPr>
+                </pic:pic>
+              </a:graphicData>
+            </a:graphic>
+          </wp:inline>
+        </w:drawing>
+      </w:r>
+    </w:p>
+    <w:p>
+      <w:pPr>
+        <w:pStyle w:val="BodyText"/>
+      </w:pPr>
+      <w:r>
+        <w:t>Fig 5: SmartShop products page simulated on a tablet screen in Chrome DevTools, showing the two-column product card layout that activates at the 768px breakpoint — between the full desktop grid and single-column mobile view.</w:t>
+      </w:r>
+    </w:p>
+    <w:p>
+      <w:pPr>
+        <w:pStyle w:val="BodyText"/>
+      </w:pPr>
+      <w:r>
+        <w:rPr>
+          <w:b/>
+          <w:bCs/>
+        </w:rPr>
+        <w:lastRenderedPageBreak/>
+        <w:t xml:space="preserve">Student Reflection </w:t>
+      </w:r>
+    </w:p>
+    <w:p>
+      <w:pPr>
+        <w:pStyle w:val="BodyText"/>
+      </w:pPr>
+      <w:r>
+        <w:t>This week I applied Responsive Web Design and Mobile-First principles to SmartShop. Fig 1 shows the desktop layout where CSS Grid arranges product cards in multiple columns across the full page width. Using Chrome DevTools in Fig 2, I simulated the mobile view and confirmed the layout collapses to a single column below 768px — providing a clean browsing experience on phones. Fig 3 shows the media queries in style.css that control these breakpoints, following a Mobile-First approach where base styles target small screens and min-width queries progressively enhance the layout for larger devices. The viewport meta tag in Fig 4 ensures mobile browsers render the page at the correct scale rather than zooming out. Fig 5 shows the tablet breakpoint in action — two columns giving a middle-ground experience between mobile and desktop. This week reinforced that a modern web application must work equally well across all screen sizes, and that CSS Grid, Flexbox, and media queries are the core tools for achieving that.</w:t>
+      </w:r>
+    </w:p>
+    <w:p>
+      <w:pPr>
+        <w:pStyle w:val="BodyText"/>
+        <w:rPr>
+          <w:i/>
+          <w:iCs/>
+        </w:rPr>
+      </w:pPr>
+      <w:r>
+        <w:rPr>
+          <w:i/>
+          <w:iCs/>
+        </w:rPr>
+        <w:t>BIT3208 – Advanced Web Design and Development</w:t>
+      </w:r>
+    </w:p>
+    <w:p>
+      <w:pPr>
+        <w:pStyle w:val="BodyText"/>
+        <w:rPr>
+          <w:i/>
+          <w:iCs/>
+        </w:rPr>
+      </w:pPr>
+      <w:r>
+        <w:rPr>
+          <w:i/>
+          <w:iCs/>
+        </w:rPr>
+        <w:t>Student: Marciah Muringi Gichohi | Admission No: BSCCS/2024/53659</w:t>
+      </w:r>
+    </w:p>
+    <w:p>
+      <w:pPr>
+        <w:pStyle w:val="BodyText"/>
+      </w:pPr>
+    </w:p>
+    <w:p>
+      <w:pPr>
+        <w:pStyle w:val="BodyText"/>
+      </w:pPr>
+      <w:r>
+        <w:rPr>
+          <w:b/>
+          <w:bCs/>
+        </w:rPr>
+        <w:t>WEEK 9: Java Web Services – Servlet Lifecycle, Session Management, and Cookies</w:t>
+      </w:r>
+    </w:p>
+    <w:p>
+      <w:pPr>
+        <w:pStyle w:val="BodyText"/>
+      </w:pPr>
+      <w:r>
+        <w:rPr>
+          <w:b/>
+          <w:bCs/>
+        </w:rPr>
+        <w:t xml:space="preserve">Title: </w:t>
+      </w:r>
+      <w:r>
+        <w:t>Session Tracking and Cookie Management in Java Web Applications</w:t>
+      </w:r>
+    </w:p>
+    <w:p>
+      <w:pPr>
+        <w:pStyle w:val="BodyText"/>
+        <w:rPr>
+          <w:b/>
+          <w:bCs/>
+        </w:rPr>
+      </w:pPr>
+      <w:r>
+        <w:rPr>
+          <w:b/>
+          <w:bCs/>
+        </w:rPr>
+        <w:t>Fig 1: Servlet Lifecycle Diagram</w:t>
+      </w:r>
+    </w:p>
+    <w:p>
+      <w:pPr>
+        <w:pStyle w:val="BodyText"/>
+      </w:pPr>
+      <w:r>
+        <w:drawing>
+          <wp:inline distT="0" distB="0" distL="0" distR="0" wp14:anchorId="09101692" wp14:editId="0BF03365">
+            <wp:extent cx="5943600" cy="1800860"/>
+            <wp:effectExtent l="0" t="0" r="0" b="0"/>
+            <wp:docPr id="2114433713" name="Picture 1"/>
+            <wp:cNvGraphicFramePr>
+              <a:graphicFrameLocks xmlns:a="http://schemas.openxmlformats.org/drawingml/2006/main" noChangeAspect="1"/>
+            </wp:cNvGraphicFramePr>
+            <a:graphic xmlns:a="http://schemas.openxmlformats.org/drawingml/2006/main">
+              <a:graphicData uri="http://schemas.openxmlformats.org/drawingml/2006/picture">
+                <pic:pic xmlns:pic="http://schemas.openxmlformats.org/drawingml/2006/picture">
+                  <pic:nvPicPr>
+                    <pic:cNvPr id="2114433713" name=""/>
+                    <pic:cNvPicPr/>
+                  </pic:nvPicPr>
+                  <pic:blipFill>
+                    <a:blip r:embed="rId51"/>
+                    <a:stretch>
+                      <a:fillRect/>
+                    </a:stretch>
+                  </pic:blipFill>
+                  <pic:spPr>
+                    <a:xfrm>
+                      <a:off x="0" y="0"/>
+                      <a:ext cx="5943600" cy="1800860"/>
+                    </a:xfrm>
+                    <a:prstGeom prst="rect">
+                      <a:avLst/>
+                    </a:prstGeom>
+                  </pic:spPr>
+                </pic:pic>
+              </a:graphicData>
+            </a:graphic>
+          </wp:inline>
+        </w:drawing>
+      </w:r>
+    </w:p>
+    <w:p>
+      <w:pPr>
+        <w:pStyle w:val="BodyText"/>
+      </w:pPr>
+      <w:r>
+        <w:t xml:space="preserve">Fig 1: Diagram illustrating the three phases of the Java Servlet lifecycle — </w:t>
       </w:r>
       <w:proofErr w:type="gramStart"/>
       <w:r>
-        <w:t>a .drawio</w:t>
+        <w:t>init(</w:t>
       </w:r>
       <w:proofErr w:type="gramEnd"/>
       <w:r>
-        <w:t xml:space="preserve"> file and exported as PNG images.</w:t>
+        <w:t xml:space="preserve">) called once on startup, </w:t>
+      </w:r>
+      <w:proofErr w:type="gramStart"/>
+      <w:r>
+        <w:t>service(</w:t>
+      </w:r>
+      <w:proofErr w:type="gramEnd"/>
+      <w:r>
+        <w:t xml:space="preserve">) called for every client request, and </w:t>
+      </w:r>
+      <w:proofErr w:type="gramStart"/>
+      <w:r>
+        <w:t>destroy(</w:t>
+      </w:r>
+      <w:proofErr w:type="gramEnd"/>
+      <w:r>
+        <w:t>) called once before the servlet is removed from memory by Apache Tomcat.</w:t>
+      </w:r>
+    </w:p>
+    <w:p>
+      <w:pPr>
+        <w:pStyle w:val="BodyText"/>
+        <w:rPr>
+          <w:b/>
+          <w:bCs/>
+        </w:rPr>
+      </w:pPr>
+      <w:r>
+        <w:rPr>
+          <w:b/>
+          <w:bCs/>
+        </w:rPr>
+        <w:t xml:space="preserve">Fig 2: Student Login Servlet – </w:t>
+      </w:r>
+      <w:proofErr w:type="spellStart"/>
+      <w:proofErr w:type="gramStart"/>
+      <w:r>
+        <w:rPr>
+          <w:b/>
+          <w:bCs/>
+        </w:rPr>
+        <w:t>doPost</w:t>
+      </w:r>
+      <w:proofErr w:type="spellEnd"/>
+      <w:r>
+        <w:rPr>
+          <w:b/>
+          <w:bCs/>
+        </w:rPr>
+        <w:t>(</w:t>
+      </w:r>
+      <w:proofErr w:type="gramEnd"/>
+      <w:r>
+        <w:rPr>
+          <w:b/>
+          <w:bCs/>
+        </w:rPr>
+        <w:t>) Method</w:t>
+      </w:r>
+    </w:p>
+    <w:p>
+      <w:pPr>
+        <w:pStyle w:val="BodyText"/>
+      </w:pPr>
+      <w:r>
+        <w:lastRenderedPageBreak/>
+        <w:drawing>
+          <wp:inline distT="0" distB="0" distL="0" distR="0" wp14:anchorId="65894F51" wp14:editId="5FB4D26E">
+            <wp:extent cx="5229955" cy="2753109"/>
+            <wp:effectExtent l="0" t="0" r="8890" b="9525"/>
+            <wp:docPr id="1417940589" name="Picture 1"/>
+            <wp:cNvGraphicFramePr>
+              <a:graphicFrameLocks xmlns:a="http://schemas.openxmlformats.org/drawingml/2006/main" noChangeAspect="1"/>
+            </wp:cNvGraphicFramePr>
+            <a:graphic xmlns:a="http://schemas.openxmlformats.org/drawingml/2006/main">
+              <a:graphicData uri="http://schemas.openxmlformats.org/drawingml/2006/picture">
+                <pic:pic xmlns:pic="http://schemas.openxmlformats.org/drawingml/2006/picture">
+                  <pic:nvPicPr>
+                    <pic:cNvPr id="1417940589" name=""/>
+                    <pic:cNvPicPr/>
+                  </pic:nvPicPr>
+                  <pic:blipFill>
+                    <a:blip r:embed="rId52"/>
+                    <a:stretch>
+                      <a:fillRect/>
+                    </a:stretch>
+                  </pic:blipFill>
+                  <pic:spPr>
+                    <a:xfrm>
+                      <a:off x="0" y="0"/>
+                      <a:ext cx="5229955" cy="2753109"/>
+                    </a:xfrm>
+                    <a:prstGeom prst="rect">
+                      <a:avLst/>
+                    </a:prstGeom>
+                  </pic:spPr>
+                </pic:pic>
+              </a:graphicData>
+            </a:graphic>
+          </wp:inline>
+        </w:drawing>
+      </w:r>
+    </w:p>
+    <w:p>
+      <w:pPr>
+        <w:pStyle w:val="BodyText"/>
+      </w:pPr>
+      <w:r>
+        <w:t xml:space="preserve">Fig 2: LoginServlet.java showing the </w:t>
+      </w:r>
+      <w:proofErr w:type="gramStart"/>
+      <w:r>
+        <w:t>doPost(</w:t>
+      </w:r>
+      <w:proofErr w:type="gramEnd"/>
+      <w:r>
+        <w:t xml:space="preserve">) method that receives username from the request, creates an HttpSession using </w:t>
+      </w:r>
+      <w:proofErr w:type="gramStart"/>
+      <w:r>
+        <w:t>request.getSession</w:t>
+      </w:r>
+      <w:proofErr w:type="gramEnd"/>
+      <w:r>
+        <w:t>(), stores the username as a session attribute, and prints a welcome message to the browser.</w:t>
+      </w:r>
+    </w:p>
+    <w:p>
+      <w:pPr>
+        <w:pStyle w:val="BodyText"/>
+        <w:rPr>
+          <w:b/>
+          <w:bCs/>
+        </w:rPr>
+      </w:pPr>
+      <w:r>
+        <w:rPr>
+          <w:b/>
+          <w:bCs/>
+        </w:rPr>
+        <w:t>Fig 3: Login JSP Page</w:t>
+      </w:r>
+    </w:p>
+    <w:p>
+      <w:pPr>
+        <w:pStyle w:val="BodyText"/>
+      </w:pPr>
+      <w:r>
+        <w:drawing>
+          <wp:inline distT="0" distB="0" distL="0" distR="0" wp14:anchorId="38E6ADAE" wp14:editId="04A1B1AC">
+            <wp:extent cx="4591691" cy="2305372"/>
+            <wp:effectExtent l="0" t="0" r="0" b="0"/>
+            <wp:docPr id="926784862" name="Picture 1"/>
+            <wp:cNvGraphicFramePr>
+              <a:graphicFrameLocks xmlns:a="http://schemas.openxmlformats.org/drawingml/2006/main" noChangeAspect="1"/>
+            </wp:cNvGraphicFramePr>
+            <a:graphic xmlns:a="http://schemas.openxmlformats.org/drawingml/2006/main">
+              <a:graphicData uri="http://schemas.openxmlformats.org/drawingml/2006/picture">
+                <pic:pic xmlns:pic="http://schemas.openxmlformats.org/drawingml/2006/picture">
+                  <pic:nvPicPr>
+                    <pic:cNvPr id="926784862" name=""/>
+                    <pic:cNvPicPr/>
+                  </pic:nvPicPr>
+                  <pic:blipFill>
+                    <a:blip r:embed="rId53"/>
+                    <a:stretch>
+                      <a:fillRect/>
+                    </a:stretch>
+                  </pic:blipFill>
+                  <pic:spPr>
+                    <a:xfrm>
+                      <a:off x="0" y="0"/>
+                      <a:ext cx="4591691" cy="2305372"/>
+                    </a:xfrm>
+                    <a:prstGeom prst="rect">
+                      <a:avLst/>
+                    </a:prstGeom>
+                  </pic:spPr>
+                </pic:pic>
+              </a:graphicData>
+            </a:graphic>
+          </wp:inline>
+        </w:drawing>
+      </w:r>
+    </w:p>
+    <w:p>
+      <w:pPr>
+        <w:pStyle w:val="BodyText"/>
+      </w:pPr>
+      <w:r>
+        <w:t>Fig 3: login.jsp page displayed in the browser with a username field and login button that submits the form to the LoginServlet via a POST request.</w:t>
+      </w:r>
+    </w:p>
+    <w:p>
+      <w:pPr>
+        <w:pStyle w:val="BodyText"/>
+        <w:rPr>
+          <w:b/>
+          <w:bCs/>
+        </w:rPr>
+      </w:pPr>
+      <w:r>
+        <w:rPr>
+          <w:b/>
+          <w:bCs/>
+        </w:rPr>
+        <w:t>Fig 4: Welcome Page Showing Session Username</w:t>
+      </w:r>
+    </w:p>
+    <w:p>
+      <w:pPr>
+        <w:pStyle w:val="BodyText"/>
+      </w:pPr>
+      <w:r>
+        <w:lastRenderedPageBreak/>
+        <w:drawing>
+          <wp:inline distT="0" distB="0" distL="0" distR="0" wp14:anchorId="1EB36172" wp14:editId="62AE0969">
+            <wp:extent cx="4953691" cy="2400635"/>
+            <wp:effectExtent l="0" t="0" r="0" b="0"/>
+            <wp:docPr id="1842021232" name="Picture 1"/>
+            <wp:cNvGraphicFramePr>
+              <a:graphicFrameLocks xmlns:a="http://schemas.openxmlformats.org/drawingml/2006/main" noChangeAspect="1"/>
+            </wp:cNvGraphicFramePr>
+            <a:graphic xmlns:a="http://schemas.openxmlformats.org/drawingml/2006/main">
+              <a:graphicData uri="http://schemas.openxmlformats.org/drawingml/2006/picture">
+                <pic:pic xmlns:pic="http://schemas.openxmlformats.org/drawingml/2006/picture">
+                  <pic:nvPicPr>
+                    <pic:cNvPr id="1842021232" name=""/>
+                    <pic:cNvPicPr/>
+                  </pic:nvPicPr>
+                  <pic:blipFill>
+                    <a:blip r:embed="rId54"/>
+                    <a:stretch>
+                      <a:fillRect/>
+                    </a:stretch>
+                  </pic:blipFill>
+                  <pic:spPr>
+                    <a:xfrm>
+                      <a:off x="0" y="0"/>
+                      <a:ext cx="4953691" cy="2400635"/>
+                    </a:xfrm>
+                    <a:prstGeom prst="rect">
+                      <a:avLst/>
+                    </a:prstGeom>
+                  </pic:spPr>
+                </pic:pic>
+              </a:graphicData>
+            </a:graphic>
+          </wp:inline>
+        </w:drawing>
+      </w:r>
+    </w:p>
+    <w:p>
+      <w:pPr>
+        <w:pStyle w:val="BodyText"/>
+      </w:pPr>
+      <w:r>
+        <w:t xml:space="preserve">Fig 4: welcome.jsp displaying the logged-in username retrieved from the HttpSession using </w:t>
+      </w:r>
+      <w:proofErr w:type="gramStart"/>
+      <w:r>
+        <w:t>session.getAttribute</w:t>
+      </w:r>
+      <w:proofErr w:type="gramEnd"/>
+      <w:r>
+        <w:t>("username"), confirming session tracking is working correctly after login.</w:t>
+      </w:r>
+    </w:p>
+    <w:p>
+      <w:pPr>
+        <w:pStyle w:val="BodyText"/>
+        <w:rPr>
+          <w:b/>
+          <w:bCs/>
+        </w:rPr>
+      </w:pPr>
+      <w:r>
+        <w:rPr>
+          <w:b/>
+          <w:bCs/>
+        </w:rPr>
+        <w:t>Fig 5: Logout Servlet – Session Invalidation and Cookie Deletion</w:t>
+      </w:r>
+    </w:p>
+    <w:p>
+      <w:pPr>
+        <w:pStyle w:val="BodyText"/>
+      </w:pPr>
+      <w:r>
+        <w:drawing>
+          <wp:inline distT="0" distB="0" distL="0" distR="0" wp14:anchorId="124F4A20" wp14:editId="06DB6899">
+            <wp:extent cx="5115639" cy="3057952"/>
+            <wp:effectExtent l="0" t="0" r="8890" b="9525"/>
+            <wp:docPr id="1504746938" name="Picture 1"/>
+            <wp:cNvGraphicFramePr>
+              <a:graphicFrameLocks xmlns:a="http://schemas.openxmlformats.org/drawingml/2006/main" noChangeAspect="1"/>
+            </wp:cNvGraphicFramePr>
+            <a:graphic xmlns:a="http://schemas.openxmlformats.org/drawingml/2006/main">
+              <a:graphicData uri="http://schemas.openxmlformats.org/drawingml/2006/picture">
+                <pic:pic xmlns:pic="http://schemas.openxmlformats.org/drawingml/2006/picture">
+                  <pic:nvPicPr>
+                    <pic:cNvPr id="1504746938" name=""/>
+                    <pic:cNvPicPr/>
+                  </pic:nvPicPr>
+                  <pic:blipFill>
+                    <a:blip r:embed="rId55"/>
+                    <a:stretch>
+                      <a:fillRect/>
+                    </a:stretch>
+                  </pic:blipFill>
+                  <pic:spPr>
+                    <a:xfrm>
+                      <a:off x="0" y="0"/>
+                      <a:ext cx="5115639" cy="3057952"/>
+                    </a:xfrm>
+                    <a:prstGeom prst="rect">
+                      <a:avLst/>
+                    </a:prstGeom>
+                  </pic:spPr>
+                </pic:pic>
+              </a:graphicData>
+            </a:graphic>
+          </wp:inline>
+        </w:drawing>
+      </w:r>
+    </w:p>
+    <w:p>
+      <w:pPr>
+        <w:pStyle w:val="BodyText"/>
+      </w:pPr>
+      <w:r>
+        <w:t xml:space="preserve">Fig 5: LogoutServlet.java showing </w:t>
+      </w:r>
+      <w:proofErr w:type="gramStart"/>
+      <w:r>
+        <w:t>session.invalidate</w:t>
+      </w:r>
+      <w:proofErr w:type="gramEnd"/>
+      <w:r>
+        <w:t>() destroying the active session and a cookie being deleted by setting its max age to zero, followed by a redirect back to the login page.</w:t>
       </w:r>
     </w:p>
     <w:p>
@@ -3973,23 +5065,2351 @@
         <w:pStyle w:val="BodyText"/>
       </w:pPr>
       <w:r>
-        <w:t>This week I applied Object-Oriented Modelling to SmartShop by creating four UML diagrams in Draw.io. The Use Case Diagram in Fig 1 helped me define system boundaries clearly — separating what a Customer can do from what only an Admin can access. The Class Diagram in Fig 2 mapped directly onto my database schema, confirming that the four tables I built in Week 5 reflect a proper object-oriented data model with associations. The Sequence Diagram in Fig 3 traced the exact execution path of the login process, which helped me understand how bcrypt, sessions, and routes interact at runtime. The Activity Diagram in Fig 4 modelled the order placement workflow, revealing that a login check must happen before an order can be saved. Fig 5 shows all four diagrams together in Draw.io. This exercise made the SmartShop system easier to reason about as a whole and would be valuable documentation for anyone maintaining or extending the application in future.</w:t>
-      </w:r>
-    </w:p>
-    <w:p>
-      <w:pPr>
-        <w:pStyle w:val="BodyText"/>
-      </w:pPr>
+        <w:t xml:space="preserve">This week I studied Java Web Services and built a Student Login System using Java Servlets, JSP, and Apache Tomcat. Fig 1 clarified the servlet lifecycle — init() runs once to prepare resources, service() handles every incoming browser request, and destroy() releases </w:t>
+      </w:r>
       <w:r>
         <w:lastRenderedPageBreak/>
-        <w:t xml:space="preserve">BIT3208 – Advanced Web Design and Development </w:t>
-      </w:r>
-    </w:p>
-    <w:p>
-      <w:pPr>
-        <w:pStyle w:val="BodyText"/>
-      </w:pPr>
-      <w:r>
+        <w:t>resources when the server shuts down. The login application in Figs 2 and 3 demonstrated how HTTP, which is stateless, requires session tracking to remember users between requests. Using HttpSession in Fig 2, I stored the username on the server after login, and Fig 4 confirmed it was retrieved correctly on the welcome page. Fig 5 showed how logout invalidates the session and removes cookies, returning the user to the login page. Comparing HttpSession and cookies, I understand that HttpSession is preferred for sensitive authentication data because it stores information server-side, while cookies are better suited for non-sensitive preferences like themes stored in the browser.</w:t>
+      </w:r>
+    </w:p>
+    <w:p>
+      <w:pPr>
+        <w:pStyle w:val="BodyText"/>
+        <w:rPr>
+          <w:i/>
+          <w:iCs/>
+        </w:rPr>
+      </w:pPr>
+      <w:r>
+        <w:rPr>
+          <w:i/>
+          <w:iCs/>
+        </w:rPr>
+        <w:t>BIT3208 – Advanced Web Design and Development</w:t>
+      </w:r>
+    </w:p>
+    <w:p>
+      <w:pPr>
+        <w:pStyle w:val="BodyText"/>
+        <w:rPr>
+          <w:i/>
+          <w:iCs/>
+        </w:rPr>
+      </w:pPr>
+      <w:r>
+        <w:rPr>
+          <w:i/>
+          <w:iCs/>
+        </w:rPr>
+        <w:t>Student: Marciah Muringi Gichohi | Admission No: BSCCS/2024/53659</w:t>
+      </w:r>
+    </w:p>
+    <w:p>
+      <w:pPr>
+        <w:pStyle w:val="BodyText"/>
+      </w:pPr>
+    </w:p>
+    <w:p>
+      <w:pPr>
+        <w:pStyle w:val="BodyText"/>
+      </w:pPr>
+      <w:r>
+        <w:rPr>
+          <w:b/>
+          <w:bCs/>
+        </w:rPr>
+        <w:t>WEEK 10: Dynamic HTML Generation and JDBC Basics</w:t>
+      </w:r>
+    </w:p>
+    <w:p>
+      <w:pPr>
+        <w:pStyle w:val="BodyText"/>
+      </w:pPr>
+      <w:r>
+        <w:rPr>
+          <w:b/>
+          <w:bCs/>
+        </w:rPr>
+        <w:t xml:space="preserve">Title: </w:t>
+      </w:r>
+      <w:r>
+        <w:t>Connecting Java Web Applications to MySQL Using JDBC</w:t>
+      </w:r>
+    </w:p>
+    <w:p>
+      <w:pPr>
+        <w:pStyle w:val="BodyText"/>
+        <w:rPr>
+          <w:b/>
+          <w:bCs/>
+        </w:rPr>
+      </w:pPr>
+      <w:r>
+        <w:rPr>
+          <w:b/>
+          <w:bCs/>
+        </w:rPr>
+        <w:t>Fig 1: studentdb Database and Students Table in phpMyAdmin</w:t>
+      </w:r>
+    </w:p>
+    <w:p>
+      <w:pPr>
+        <w:pStyle w:val="BodyText"/>
+      </w:pPr>
+      <w:r>
+        <w:drawing>
+          <wp:inline distT="0" distB="0" distL="0" distR="0" wp14:anchorId="69F7FE96" wp14:editId="3323F6BD">
+            <wp:extent cx="5943600" cy="2773680"/>
+            <wp:effectExtent l="0" t="0" r="0" b="0"/>
+            <wp:docPr id="1548975704" name="Picture 1"/>
+            <wp:cNvGraphicFramePr>
+              <a:graphicFrameLocks xmlns:a="http://schemas.openxmlformats.org/drawingml/2006/main" noChangeAspect="1"/>
+            </wp:cNvGraphicFramePr>
+            <a:graphic xmlns:a="http://schemas.openxmlformats.org/drawingml/2006/main">
+              <a:graphicData uri="http://schemas.openxmlformats.org/drawingml/2006/picture">
+                <pic:pic xmlns:pic="http://schemas.openxmlformats.org/drawingml/2006/picture">
+                  <pic:nvPicPr>
+                    <pic:cNvPr id="1548975704" name=""/>
+                    <pic:cNvPicPr/>
+                  </pic:nvPicPr>
+                  <pic:blipFill>
+                    <a:blip r:embed="rId56"/>
+                    <a:stretch>
+                      <a:fillRect/>
+                    </a:stretch>
+                  </pic:blipFill>
+                  <pic:spPr>
+                    <a:xfrm>
+                      <a:off x="0" y="0"/>
+                      <a:ext cx="5943600" cy="2773680"/>
+                    </a:xfrm>
+                    <a:prstGeom prst="rect">
+                      <a:avLst/>
+                    </a:prstGeom>
+                  </pic:spPr>
+                </pic:pic>
+              </a:graphicData>
+            </a:graphic>
+          </wp:inline>
+        </w:drawing>
+      </w:r>
+    </w:p>
+    <w:p>
+      <w:pPr>
+        <w:pStyle w:val="BodyText"/>
+      </w:pPr>
+      <w:r>
+        <w:t>Fig 1: phpMyAdmin showing the studentdb database with the students table containing columns id, name, course, and email — the database created using the CREATE DATABASE and CREATE TABLE SQL statements.</w:t>
+      </w:r>
+    </w:p>
+    <w:p>
+      <w:pPr>
+        <w:pStyle w:val="BodyText"/>
+        <w:rPr>
+          <w:b/>
+          <w:bCs/>
+        </w:rPr>
+      </w:pPr>
+      <w:r>
+        <w:rPr>
+          <w:b/>
+          <w:bCs/>
+        </w:rPr>
+        <w:t>Fig 2: JDBC Connection Code in DBConnection.java</w:t>
+      </w:r>
+    </w:p>
+    <w:p>
+      <w:pPr>
+        <w:pStyle w:val="BodyText"/>
+      </w:pPr>
+      <w:r>
+        <w:lastRenderedPageBreak/>
+        <w:drawing>
+          <wp:inline distT="0" distB="0" distL="0" distR="0" wp14:anchorId="46400431" wp14:editId="20EDAC16">
+            <wp:extent cx="4477375" cy="2686425"/>
+            <wp:effectExtent l="0" t="0" r="0" b="0"/>
+            <wp:docPr id="1427569431" name="Picture 1"/>
+            <wp:cNvGraphicFramePr>
+              <a:graphicFrameLocks xmlns:a="http://schemas.openxmlformats.org/drawingml/2006/main" noChangeAspect="1"/>
+            </wp:cNvGraphicFramePr>
+            <a:graphic xmlns:a="http://schemas.openxmlformats.org/drawingml/2006/main">
+              <a:graphicData uri="http://schemas.openxmlformats.org/drawingml/2006/picture">
+                <pic:pic xmlns:pic="http://schemas.openxmlformats.org/drawingml/2006/picture">
+                  <pic:nvPicPr>
+                    <pic:cNvPr id="1427569431" name=""/>
+                    <pic:cNvPicPr/>
+                  </pic:nvPicPr>
+                  <pic:blipFill>
+                    <a:blip r:embed="rId57"/>
+                    <a:stretch>
+                      <a:fillRect/>
+                    </a:stretch>
+                  </pic:blipFill>
+                  <pic:spPr>
+                    <a:xfrm>
+                      <a:off x="0" y="0"/>
+                      <a:ext cx="4477375" cy="2686425"/>
+                    </a:xfrm>
+                    <a:prstGeom prst="rect">
+                      <a:avLst/>
+                    </a:prstGeom>
+                  </pic:spPr>
+                </pic:pic>
+              </a:graphicData>
+            </a:graphic>
+          </wp:inline>
+        </w:drawing>
+      </w:r>
+    </w:p>
+    <w:p>
+      <w:pPr>
+        <w:pStyle w:val="BodyText"/>
+      </w:pPr>
+      <w:r>
+        <w:t>Fig 2: DBConnection.java showing Class.forName() loading the MySQL JDBC driver and DriverManager.getConnection() establishing a connection to the studentdb database on localhost.</w:t>
+      </w:r>
+    </w:p>
+    <w:p>
+      <w:pPr>
+        <w:pStyle w:val="BodyText"/>
+        <w:rPr>
+          <w:b/>
+          <w:bCs/>
+        </w:rPr>
+      </w:pPr>
+      <w:r>
+        <w:rPr>
+          <w:b/>
+          <w:bCs/>
+        </w:rPr>
+        <w:t>Fig 3: Student Registration Form (addStudent.jsp)</w:t>
+      </w:r>
+    </w:p>
+    <w:p>
+      <w:pPr>
+        <w:pStyle w:val="BodyText"/>
+      </w:pPr>
+      <w:r>
+        <w:drawing>
+          <wp:inline distT="0" distB="0" distL="0" distR="0" wp14:anchorId="10364E61" wp14:editId="0E6997E3">
+            <wp:extent cx="4696480" cy="3848637"/>
+            <wp:effectExtent l="0" t="0" r="8890" b="0"/>
+            <wp:docPr id="1190178039" name="Picture 1"/>
+            <wp:cNvGraphicFramePr>
+              <a:graphicFrameLocks xmlns:a="http://schemas.openxmlformats.org/drawingml/2006/main" noChangeAspect="1"/>
+            </wp:cNvGraphicFramePr>
+            <a:graphic xmlns:a="http://schemas.openxmlformats.org/drawingml/2006/main">
+              <a:graphicData uri="http://schemas.openxmlformats.org/drawingml/2006/picture">
+                <pic:pic xmlns:pic="http://schemas.openxmlformats.org/drawingml/2006/picture">
+                  <pic:nvPicPr>
+                    <pic:cNvPr id="1190178039" name=""/>
+                    <pic:cNvPicPr/>
+                  </pic:nvPicPr>
+                  <pic:blipFill>
+                    <a:blip r:embed="rId58"/>
+                    <a:stretch>
+                      <a:fillRect/>
+                    </a:stretch>
+                  </pic:blipFill>
+                  <pic:spPr>
+                    <a:xfrm>
+                      <a:off x="0" y="0"/>
+                      <a:ext cx="4696480" cy="3848637"/>
+                    </a:xfrm>
+                    <a:prstGeom prst="rect">
+                      <a:avLst/>
+                    </a:prstGeom>
+                  </pic:spPr>
+                </pic:pic>
+              </a:graphicData>
+            </a:graphic>
+          </wp:inline>
+        </w:drawing>
+      </w:r>
+    </w:p>
+    <w:p>
+      <w:pPr>
+        <w:pStyle w:val="BodyText"/>
+      </w:pPr>
+      <w:r>
+        <w:lastRenderedPageBreak/>
+        <w:t>Fig 3: addStudent.jsp form displayed in the browser with fields for student name, course, and email — submitting this form triggers the StudentServlet to execute an INSERT SQL query using PreparedStatement.</w:t>
+      </w:r>
+    </w:p>
+    <w:p>
+      <w:pPr>
+        <w:pStyle w:val="BodyText"/>
+        <w:rPr>
+          <w:b/>
+          <w:bCs/>
+        </w:rPr>
+      </w:pPr>
+      <w:r>
+        <w:rPr>
+          <w:b/>
+          <w:bCs/>
+        </w:rPr>
+        <w:t>Fig 4: Students Table After Inserting a Record</w:t>
+      </w:r>
+    </w:p>
+    <w:p>
+      <w:pPr>
+        <w:pStyle w:val="BodyText"/>
+      </w:pPr>
+      <w:r>
+        <w:drawing>
+          <wp:inline distT="0" distB="0" distL="0" distR="0" wp14:anchorId="4360EDA4" wp14:editId="195E75D8">
+            <wp:extent cx="5391150" cy="3374681"/>
+            <wp:effectExtent l="0" t="0" r="0" b="0"/>
+            <wp:docPr id="1198656850" name="Picture 1"/>
+            <wp:cNvGraphicFramePr>
+              <a:graphicFrameLocks xmlns:a="http://schemas.openxmlformats.org/drawingml/2006/main" noChangeAspect="1"/>
+            </wp:cNvGraphicFramePr>
+            <a:graphic xmlns:a="http://schemas.openxmlformats.org/drawingml/2006/main">
+              <a:graphicData uri="http://schemas.openxmlformats.org/drawingml/2006/picture">
+                <pic:pic xmlns:pic="http://schemas.openxmlformats.org/drawingml/2006/picture">
+                  <pic:nvPicPr>
+                    <pic:cNvPr id="1198656850" name=""/>
+                    <pic:cNvPicPr/>
+                  </pic:nvPicPr>
+                  <pic:blipFill>
+                    <a:blip r:embed="rId59"/>
+                    <a:stretch>
+                      <a:fillRect/>
+                    </a:stretch>
+                  </pic:blipFill>
+                  <pic:spPr>
+                    <a:xfrm>
+                      <a:off x="0" y="0"/>
+                      <a:ext cx="5408544" cy="3385569"/>
+                    </a:xfrm>
+                    <a:prstGeom prst="rect">
+                      <a:avLst/>
+                    </a:prstGeom>
+                  </pic:spPr>
+                </pic:pic>
+              </a:graphicData>
+            </a:graphic>
+          </wp:inline>
+        </w:drawing>
+      </w:r>
+    </w:p>
+    <w:p>
+      <w:pPr>
+        <w:pStyle w:val="BodyText"/>
+      </w:pPr>
+      <w:r>
+        <w:t>Fig 4: phpMyAdmin students table showing a newly added student record, confirming the JDBC INSERT operation executed successfully and data was saved to the database.</w:t>
+      </w:r>
+    </w:p>
+    <w:p>
+      <w:pPr>
+        <w:pStyle w:val="BodyText"/>
+        <w:rPr>
+          <w:b/>
+          <w:bCs/>
+        </w:rPr>
+      </w:pPr>
+      <w:r>
+        <w:rPr>
+          <w:b/>
+          <w:bCs/>
+        </w:rPr>
+        <w:t xml:space="preserve">Fig 5: Dynamic Student Records Table in </w:t>
+      </w:r>
+      <w:proofErr w:type="spellStart"/>
+      <w:r>
+        <w:rPr>
+          <w:b/>
+          <w:bCs/>
+        </w:rPr>
+        <w:t>viewStudents.jsp</w:t>
+      </w:r>
+      <w:proofErr w:type="spellEnd"/>
+    </w:p>
+    <w:p>
+      <w:pPr>
+        <w:pStyle w:val="BodyText"/>
+      </w:pPr>
+      <w:r>
+        <w:lastRenderedPageBreak/>
+        <w:drawing>
+          <wp:inline distT="0" distB="0" distL="0" distR="0" wp14:anchorId="51A9CA2C" wp14:editId="6D828946">
+            <wp:extent cx="4695825" cy="4482781"/>
+            <wp:effectExtent l="0" t="0" r="0" b="0"/>
+            <wp:docPr id="390734977" name="Picture 1"/>
+            <wp:cNvGraphicFramePr>
+              <a:graphicFrameLocks xmlns:a="http://schemas.openxmlformats.org/drawingml/2006/main" noChangeAspect="1"/>
+            </wp:cNvGraphicFramePr>
+            <a:graphic xmlns:a="http://schemas.openxmlformats.org/drawingml/2006/main">
+              <a:graphicData uri="http://schemas.openxmlformats.org/drawingml/2006/picture">
+                <pic:pic xmlns:pic="http://schemas.openxmlformats.org/drawingml/2006/picture">
+                  <pic:nvPicPr>
+                    <pic:cNvPr id="390734977" name=""/>
+                    <pic:cNvPicPr/>
+                  </pic:nvPicPr>
+                  <pic:blipFill>
+                    <a:blip r:embed="rId60"/>
+                    <a:stretch>
+                      <a:fillRect/>
+                    </a:stretch>
+                  </pic:blipFill>
+                  <pic:spPr>
+                    <a:xfrm>
+                      <a:off x="0" y="0"/>
+                      <a:ext cx="4697692" cy="4484564"/>
+                    </a:xfrm>
+                    <a:prstGeom prst="rect">
+                      <a:avLst/>
+                    </a:prstGeom>
+                  </pic:spPr>
+                </pic:pic>
+              </a:graphicData>
+            </a:graphic>
+          </wp:inline>
+        </w:drawing>
+      </w:r>
+    </w:p>
+    <w:p>
+      <w:pPr>
+        <w:pStyle w:val="BodyText"/>
+      </w:pPr>
+      <w:r>
+        <w:t>Fig 5: viewStudents.jsp displaying all student records dynamically in an HTML table — data retrieved from MySQL using a ResultSet and rendered using JSP scriptlets inside the table rows.</w:t>
+      </w:r>
+    </w:p>
+    <w:p>
+      <w:pPr>
+        <w:pStyle w:val="BodyText"/>
+      </w:pPr>
+      <w:r>
+        <w:rPr>
+          <w:b/>
+          <w:bCs/>
+        </w:rPr>
+        <w:t xml:space="preserve">Student Reflection </w:t>
+      </w:r>
+    </w:p>
+    <w:p>
+      <w:pPr>
+        <w:pStyle w:val="BodyText"/>
+      </w:pPr>
+      <w:r>
+        <w:t>This week I connected the Student Management Web Application to a MySQL database using JDBC. Fig 1 shows the studentdb database and students table created in phpMyAdmin. Fig 2 shows DBConnection.java where JDBC loads the MySQL driver and opens a database connection — the foundation that all subsequent database operations depend on. The registration form in Fig 3 collects student details and submits them to StudentServlet, which uses a PreparedStatement to execute a parameterized INSERT query, preventing SQL injection. Fig 4 confirms the insert worked by showing the new record in phpMyAdmin. Fig 5 shows the dynamic display page where JSP retrieves all records using a ResultSet and renders them in an HTML table — demonstrating how static pages become dynamic when connected to a database. The key difference from previous weeks is that content now comes from the database rather than being hardcoded into HTML.</w:t>
+      </w:r>
+    </w:p>
+    <w:p>
+      <w:pPr>
+        <w:pStyle w:val="BodyText"/>
+        <w:rPr>
+          <w:i/>
+          <w:iCs/>
+        </w:rPr>
+      </w:pPr>
+      <w:r>
+        <w:rPr>
+          <w:i/>
+          <w:iCs/>
+        </w:rPr>
+        <w:t>BIT3208 – Advanced Web Design and Development</w:t>
+      </w:r>
+    </w:p>
+    <w:p>
+      <w:pPr>
+        <w:pStyle w:val="BodyText"/>
+        <w:rPr>
+          <w:i/>
+          <w:iCs/>
+        </w:rPr>
+      </w:pPr>
+      <w:r>
+        <w:rPr>
+          <w:i/>
+          <w:iCs/>
+        </w:rPr>
+        <w:t>Student: Marciah Muringi Gichohi | Admission No: BSCCS/2024/53659</w:t>
+      </w:r>
+    </w:p>
+    <w:p>
+      <w:pPr>
+        <w:pStyle w:val="BodyText"/>
+      </w:pPr>
+    </w:p>
+    <w:p>
+      <w:pPr>
+        <w:pStyle w:val="BodyText"/>
+      </w:pPr>
+      <w:r>
+        <w:rPr>
+          <w:b/>
+          <w:bCs/>
+        </w:rPr>
+        <w:t>WEEK 11: Building Dynamic Pages with Full Database Integration (CRUD)</w:t>
+      </w:r>
+    </w:p>
+    <w:p>
+      <w:pPr>
+        <w:pStyle w:val="BodyText"/>
+      </w:pPr>
+      <w:r>
+        <w:rPr>
+          <w:b/>
+          <w:bCs/>
+        </w:rPr>
+        <w:t xml:space="preserve">Title: </w:t>
+      </w:r>
+      <w:r>
+        <w:t>Full CRUD Operations with JDBC – Student Management System</w:t>
+      </w:r>
+    </w:p>
+    <w:p>
+      <w:pPr>
+        <w:pStyle w:val="BodyText"/>
+        <w:rPr>
+          <w:b/>
+          <w:bCs/>
+        </w:rPr>
+      </w:pPr>
+      <w:r>
+        <w:rPr>
+          <w:b/>
+          <w:bCs/>
+        </w:rPr>
+        <w:t>Fig 1: Add Student Form and Database Insert</w:t>
+      </w:r>
+    </w:p>
+    <w:p>
+      <w:pPr>
+        <w:pStyle w:val="BodyText"/>
+      </w:pPr>
+      <w:r>
+        <w:drawing>
+          <wp:inline distT="0" distB="0" distL="0" distR="0" wp14:anchorId="29C84266" wp14:editId="02A7FFD3">
+            <wp:extent cx="5677692" cy="2915057"/>
+            <wp:effectExtent l="0" t="0" r="0" b="0"/>
+            <wp:docPr id="1187189154" name="Picture 1"/>
+            <wp:cNvGraphicFramePr>
+              <a:graphicFrameLocks xmlns:a="http://schemas.openxmlformats.org/drawingml/2006/main" noChangeAspect="1"/>
+            </wp:cNvGraphicFramePr>
+            <a:graphic xmlns:a="http://schemas.openxmlformats.org/drawingml/2006/main">
+              <a:graphicData uri="http://schemas.openxmlformats.org/drawingml/2006/picture">
+                <pic:pic xmlns:pic="http://schemas.openxmlformats.org/drawingml/2006/picture">
+                  <pic:nvPicPr>
+                    <pic:cNvPr id="1187189154" name=""/>
+                    <pic:cNvPicPr/>
+                  </pic:nvPicPr>
+                  <pic:blipFill>
+                    <a:blip r:embed="rId61"/>
+                    <a:stretch>
+                      <a:fillRect/>
+                    </a:stretch>
+                  </pic:blipFill>
+                  <pic:spPr>
+                    <a:xfrm>
+                      <a:off x="0" y="0"/>
+                      <a:ext cx="5677692" cy="2915057"/>
+                    </a:xfrm>
+                    <a:prstGeom prst="rect">
+                      <a:avLst/>
+                    </a:prstGeom>
+                  </pic:spPr>
+                </pic:pic>
+              </a:graphicData>
+            </a:graphic>
+          </wp:inline>
+        </w:drawing>
+      </w:r>
+    </w:p>
+    <w:p>
+      <w:pPr>
+        <w:pStyle w:val="BodyText"/>
+      </w:pPr>
+      <w:r>
+        <w:t>Fig 1: addStudent.jsp form with submitted data resulting in a successful INSERT query — demonstrating the Create operation of the CRUD cycle using JDBC PreparedStatement.</w:t>
+      </w:r>
+    </w:p>
+    <w:p>
+      <w:pPr>
+        <w:pStyle w:val="BodyText"/>
+        <w:rPr>
+          <w:b/>
+          <w:bCs/>
+        </w:rPr>
+      </w:pPr>
+      <w:r>
+        <w:rPr>
+          <w:b/>
+          <w:bCs/>
+        </w:rPr>
+        <w:t xml:space="preserve">Fig 2: All Students Listed Dynamically in </w:t>
+      </w:r>
+      <w:proofErr w:type="spellStart"/>
+      <w:r>
+        <w:rPr>
+          <w:b/>
+          <w:bCs/>
+        </w:rPr>
+        <w:t>viewStudents.jsp</w:t>
+      </w:r>
+      <w:proofErr w:type="spellEnd"/>
+    </w:p>
+    <w:p>
+      <w:pPr>
+        <w:pStyle w:val="BodyText"/>
+      </w:pPr>
+      <w:r>
+        <w:lastRenderedPageBreak/>
+        <w:drawing>
+          <wp:inline distT="0" distB="0" distL="0" distR="0" wp14:anchorId="4345DE17" wp14:editId="6A65F26B">
+            <wp:extent cx="3848637" cy="3391373"/>
+            <wp:effectExtent l="0" t="0" r="0" b="0"/>
+            <wp:docPr id="1601040572" name="Picture 1"/>
+            <wp:cNvGraphicFramePr>
+              <a:graphicFrameLocks xmlns:a="http://schemas.openxmlformats.org/drawingml/2006/main" noChangeAspect="1"/>
+            </wp:cNvGraphicFramePr>
+            <a:graphic xmlns:a="http://schemas.openxmlformats.org/drawingml/2006/main">
+              <a:graphicData uri="http://schemas.openxmlformats.org/drawingml/2006/picture">
+                <pic:pic xmlns:pic="http://schemas.openxmlformats.org/drawingml/2006/picture">
+                  <pic:nvPicPr>
+                    <pic:cNvPr id="1601040572" name=""/>
+                    <pic:cNvPicPr/>
+                  </pic:nvPicPr>
+                  <pic:blipFill>
+                    <a:blip r:embed="rId62"/>
+                    <a:stretch>
+                      <a:fillRect/>
+                    </a:stretch>
+                  </pic:blipFill>
+                  <pic:spPr>
+                    <a:xfrm>
+                      <a:off x="0" y="0"/>
+                      <a:ext cx="3848637" cy="3391373"/>
+                    </a:xfrm>
+                    <a:prstGeom prst="rect">
+                      <a:avLst/>
+                    </a:prstGeom>
+                  </pic:spPr>
+                </pic:pic>
+              </a:graphicData>
+            </a:graphic>
+          </wp:inline>
+        </w:drawing>
+      </w:r>
+    </w:p>
+    <w:p>
+      <w:pPr>
+        <w:pStyle w:val="BodyText"/>
+      </w:pPr>
+      <w:r>
+        <w:t xml:space="preserve">Fig 2: viewStudents.jsp displaying multiple student records in a dynamic HTML table with Edit and Delete action buttons beside each record — demonstrating the Read operation retrieving all rows from the </w:t>
+      </w:r>
+      <w:proofErr w:type="gramStart"/>
+      <w:r>
+        <w:t>students</w:t>
+      </w:r>
+      <w:proofErr w:type="gramEnd"/>
+      <w:r>
+        <w:t xml:space="preserve"> table.</w:t>
+      </w:r>
+    </w:p>
+    <w:p>
+      <w:pPr>
+        <w:pStyle w:val="BodyText"/>
+        <w:rPr>
+          <w:b/>
+          <w:bCs/>
+        </w:rPr>
+      </w:pPr>
+      <w:r>
+        <w:rPr>
+          <w:b/>
+          <w:bCs/>
+        </w:rPr>
+        <w:t>Fig 3: Edit Student Form Pre-Populated from Database</w:t>
+      </w:r>
+    </w:p>
+    <w:p>
+      <w:pPr>
+        <w:pStyle w:val="BodyText"/>
+      </w:pPr>
+      <w:r>
+        <w:drawing>
+          <wp:inline distT="0" distB="0" distL="0" distR="0" wp14:anchorId="2C1139C7" wp14:editId="2BE2481C">
+            <wp:extent cx="4486901" cy="2810267"/>
+            <wp:effectExtent l="0" t="0" r="9525" b="9525"/>
+            <wp:docPr id="110405840" name="Picture 1"/>
+            <wp:cNvGraphicFramePr>
+              <a:graphicFrameLocks xmlns:a="http://schemas.openxmlformats.org/drawingml/2006/main" noChangeAspect="1"/>
+            </wp:cNvGraphicFramePr>
+            <a:graphic xmlns:a="http://schemas.openxmlformats.org/drawingml/2006/main">
+              <a:graphicData uri="http://schemas.openxmlformats.org/drawingml/2006/picture">
+                <pic:pic xmlns:pic="http://schemas.openxmlformats.org/drawingml/2006/picture">
+                  <pic:nvPicPr>
+                    <pic:cNvPr id="110405840" name=""/>
+                    <pic:cNvPicPr/>
+                  </pic:nvPicPr>
+                  <pic:blipFill>
+                    <a:blip r:embed="rId63"/>
+                    <a:stretch>
+                      <a:fillRect/>
+                    </a:stretch>
+                  </pic:blipFill>
+                  <pic:spPr>
+                    <a:xfrm>
+                      <a:off x="0" y="0"/>
+                      <a:ext cx="4486901" cy="2810267"/>
+                    </a:xfrm>
+                    <a:prstGeom prst="rect">
+                      <a:avLst/>
+                    </a:prstGeom>
+                  </pic:spPr>
+                </pic:pic>
+              </a:graphicData>
+            </a:graphic>
+          </wp:inline>
+        </w:drawing>
+      </w:r>
+    </w:p>
+    <w:p>
+      <w:pPr>
+        <w:pStyle w:val="BodyText"/>
+      </w:pPr>
+      <w:r>
+        <w:t>Fig 3: editStudent.jsp pre-populated with an existing student's data retrieved by ID from the database — submitting the form executes an UPDATE SQL query via PreparedStatement to save the changes.</w:t>
+      </w:r>
+    </w:p>
+    <w:p>
+      <w:pPr>
+        <w:pStyle w:val="BodyText"/>
+        <w:rPr>
+          <w:b/>
+          <w:bCs/>
+        </w:rPr>
+      </w:pPr>
+      <w:r>
+        <w:rPr>
+          <w:b/>
+          <w:bCs/>
+        </w:rPr>
+        <w:t>Fig 4: Delete Confirmation and Record Removal</w:t>
+      </w:r>
+    </w:p>
+    <w:p>
+      <w:pPr>
+        <w:pStyle w:val="BodyText"/>
+      </w:pPr>
+      <w:r>
+        <w:lastRenderedPageBreak/>
+        <w:drawing>
+          <wp:inline distT="0" distB="0" distL="0" distR="0" wp14:anchorId="718782AA" wp14:editId="6B1C62C8">
+            <wp:extent cx="4733925" cy="3477614"/>
+            <wp:effectExtent l="0" t="0" r="0" b="0"/>
+            <wp:docPr id="1504271823" name="Picture 1"/>
+            <wp:cNvGraphicFramePr>
+              <a:graphicFrameLocks xmlns:a="http://schemas.openxmlformats.org/drawingml/2006/main" noChangeAspect="1"/>
+            </wp:cNvGraphicFramePr>
+            <a:graphic xmlns:a="http://schemas.openxmlformats.org/drawingml/2006/main">
+              <a:graphicData uri="http://schemas.openxmlformats.org/drawingml/2006/picture">
+                <pic:pic xmlns:pic="http://schemas.openxmlformats.org/drawingml/2006/picture">
+                  <pic:nvPicPr>
+                    <pic:cNvPr id="1504271823" name=""/>
+                    <pic:cNvPicPr/>
+                  </pic:nvPicPr>
+                  <pic:blipFill>
+                    <a:blip r:embed="rId64"/>
+                    <a:stretch>
+                      <a:fillRect/>
+                    </a:stretch>
+                  </pic:blipFill>
+                  <pic:spPr>
+                    <a:xfrm>
+                      <a:off x="0" y="0"/>
+                      <a:ext cx="4745471" cy="3486096"/>
+                    </a:xfrm>
+                    <a:prstGeom prst="rect">
+                      <a:avLst/>
+                    </a:prstGeom>
+                  </pic:spPr>
+                </pic:pic>
+              </a:graphicData>
+            </a:graphic>
+          </wp:inline>
+        </w:drawing>
+      </w:r>
+    </w:p>
+    <w:p>
+      <w:pPr>
+        <w:pStyle w:val="BodyText"/>
+      </w:pPr>
+      <w:r>
+        <w:t>Fig 4: Student record successfully deleted from the database after confirmation — the DELETE SQL query was executed using PreparedStatement with the student ID as a parameter, and the updated list is displayed without the removed record.</w:t>
+      </w:r>
+    </w:p>
+    <w:p>
+      <w:pPr>
+        <w:pStyle w:val="BodyText"/>
+        <w:rPr>
+          <w:b/>
+          <w:bCs/>
+        </w:rPr>
+      </w:pPr>
+      <w:r>
+        <w:rPr>
+          <w:b/>
+          <w:bCs/>
+        </w:rPr>
+        <w:t>Fig 5: Search Feature Returning Filtered Results</w:t>
+      </w:r>
+    </w:p>
+    <w:p>
+      <w:pPr>
+        <w:pStyle w:val="BodyText"/>
+      </w:pPr>
+      <w:r>
+        <w:drawing>
+          <wp:inline distT="0" distB="0" distL="0" distR="0" wp14:anchorId="1A28A846" wp14:editId="24CC518F">
+            <wp:extent cx="4906060" cy="2067213"/>
+            <wp:effectExtent l="0" t="0" r="8890" b="9525"/>
+            <wp:docPr id="2020131582" name="Picture 1"/>
+            <wp:cNvGraphicFramePr>
+              <a:graphicFrameLocks xmlns:a="http://schemas.openxmlformats.org/drawingml/2006/main" noChangeAspect="1"/>
+            </wp:cNvGraphicFramePr>
+            <a:graphic xmlns:a="http://schemas.openxmlformats.org/drawingml/2006/main">
+              <a:graphicData uri="http://schemas.openxmlformats.org/drawingml/2006/picture">
+                <pic:pic xmlns:pic="http://schemas.openxmlformats.org/drawingml/2006/picture">
+                  <pic:nvPicPr>
+                    <pic:cNvPr id="2020131582" name=""/>
+                    <pic:cNvPicPr/>
+                  </pic:nvPicPr>
+                  <pic:blipFill>
+                    <a:blip r:embed="rId65"/>
+                    <a:stretch>
+                      <a:fillRect/>
+                    </a:stretch>
+                  </pic:blipFill>
+                  <pic:spPr>
+                    <a:xfrm>
+                      <a:off x="0" y="0"/>
+                      <a:ext cx="4906060" cy="2067213"/>
+                    </a:xfrm>
+                    <a:prstGeom prst="rect">
+                      <a:avLst/>
+                    </a:prstGeom>
+                  </pic:spPr>
+                </pic:pic>
+              </a:graphicData>
+            </a:graphic>
+          </wp:inline>
+        </w:drawing>
+      </w:r>
+    </w:p>
+    <w:p>
+      <w:pPr>
+        <w:pStyle w:val="BodyText"/>
+      </w:pPr>
+      <w:r>
+        <w:t>Fig 5: Search form returning student records matching a name search using a LIKE query — demonstrating dynamic filtering of database records in a JSP page.</w:t>
+      </w:r>
+    </w:p>
+    <w:p>
+      <w:pPr>
+        <w:pStyle w:val="BodyText"/>
+      </w:pPr>
+      <w:r>
+        <w:rPr>
+          <w:b/>
+          <w:bCs/>
+        </w:rPr>
+        <w:t xml:space="preserve">Student Reflection </w:t>
+      </w:r>
+    </w:p>
+    <w:p>
+      <w:pPr>
+        <w:pStyle w:val="BodyText"/>
+      </w:pPr>
+      <w:r>
+        <w:t xml:space="preserve">This week I completed the full CRUD implementation of the Student Management System using JDBC. Fig 1 shows the Create operation inserting a new student record. Fig 2 demonstrates the Read operation — all students are retrieved and displayed in a dynamic table with action buttons, making the system interactive. The Update operation in Fig 3 </w:t>
+      </w:r>
+      <w:r>
+        <w:lastRenderedPageBreak/>
+        <w:t>shows the edit form pre-filled using a SELECT query, with changes saved via an UPDATE query. Fig 4 completes the CRUD cycle with the Delete operation removing a record after confirmation. Fig 5 adds a search feature using a SQL LIKE query, allowing users to find specific students without scrolling through the full list. Throughout, PreparedStatement was used for all queries to prevent SQL injection. Comparing this to the Node.js/MySQL approach used in SmartShop, I can see the same CRUD concepts apply across different technologies — the SQL queries are identical, only the programming language and connection method differ.</w:t>
+      </w:r>
+    </w:p>
+    <w:p>
+      <w:pPr>
+        <w:pStyle w:val="BodyText"/>
+        <w:rPr>
+          <w:i/>
+          <w:iCs/>
+        </w:rPr>
+      </w:pPr>
+      <w:r>
+        <w:rPr>
+          <w:i/>
+          <w:iCs/>
+        </w:rPr>
+        <w:t>BIT3208 – Advanced Web Design and Development</w:t>
+      </w:r>
+    </w:p>
+    <w:p>
+      <w:pPr>
+        <w:pStyle w:val="BodyText"/>
+        <w:rPr>
+          <w:i/>
+          <w:iCs/>
+        </w:rPr>
+      </w:pPr>
+      <w:r>
+        <w:rPr>
+          <w:i/>
+          <w:iCs/>
+        </w:rPr>
+        <w:t>Student: Marciah Muringi Gichohi | Admission No: BSCCS/2024/53659</w:t>
+      </w:r>
+    </w:p>
+    <w:p>
+      <w:pPr>
+        <w:pStyle w:val="BodyText"/>
+      </w:pPr>
+    </w:p>
+    <w:p>
+      <w:pPr>
+        <w:pStyle w:val="BodyText"/>
+      </w:pPr>
+      <w:r>
+        <w:rPr>
+          <w:b/>
+          <w:bCs/>
+        </w:rPr>
+        <w:t>WEEK 12: ASP.NET Concepts – Object Model, Control Structures, and Session Management</w:t>
+      </w:r>
+    </w:p>
+    <w:p>
+      <w:pPr>
+        <w:pStyle w:val="BodyText"/>
+      </w:pPr>
+      <w:r>
+        <w:rPr>
+          <w:b/>
+          <w:bCs/>
+        </w:rPr>
+        <w:t xml:space="preserve">Title: </w:t>
+      </w:r>
+      <w:r>
+        <w:t>Developing ASP.NET Web Forms with Session Management and SQL Server</w:t>
+      </w:r>
+    </w:p>
+    <w:p>
+      <w:pPr>
+        <w:pStyle w:val="BodyText"/>
+        <w:rPr>
+          <w:b/>
+          <w:bCs/>
+        </w:rPr>
+      </w:pPr>
+      <w:r>
+        <w:rPr>
+          <w:b/>
+          <w:bCs/>
+        </w:rPr>
+        <w:t>Fig 1: ASP.NET Student Registration Web Form in Visual Studio</w:t>
+      </w:r>
+    </w:p>
+    <w:p>
+      <w:pPr>
+        <w:pStyle w:val="BodyText"/>
+      </w:pPr>
+      <w:r>
+        <w:drawing>
+          <wp:inline distT="0" distB="0" distL="0" distR="0" wp14:anchorId="0FB98644" wp14:editId="1CDD1129">
+            <wp:extent cx="4400550" cy="3467871"/>
+            <wp:effectExtent l="0" t="0" r="0" b="0"/>
+            <wp:docPr id="1486913198" name="Picture 1"/>
+            <wp:cNvGraphicFramePr>
+              <a:graphicFrameLocks xmlns:a="http://schemas.openxmlformats.org/drawingml/2006/main" noChangeAspect="1"/>
+            </wp:cNvGraphicFramePr>
+            <a:graphic xmlns:a="http://schemas.openxmlformats.org/drawingml/2006/main">
+              <a:graphicData uri="http://schemas.openxmlformats.org/drawingml/2006/picture">
+                <pic:pic xmlns:pic="http://schemas.openxmlformats.org/drawingml/2006/picture">
+                  <pic:nvPicPr>
+                    <pic:cNvPr id="1486913198" name=""/>
+                    <pic:cNvPicPr/>
+                  </pic:nvPicPr>
+                  <pic:blipFill>
+                    <a:blip r:embed="rId66"/>
+                    <a:stretch>
+                      <a:fillRect/>
+                    </a:stretch>
+                  </pic:blipFill>
+                  <pic:spPr>
+                    <a:xfrm>
+                      <a:off x="0" y="0"/>
+                      <a:ext cx="4405090" cy="3471449"/>
+                    </a:xfrm>
+                    <a:prstGeom prst="rect">
+                      <a:avLst/>
+                    </a:prstGeom>
+                  </pic:spPr>
+                </pic:pic>
+              </a:graphicData>
+            </a:graphic>
+          </wp:inline>
+        </w:drawing>
+      </w:r>
+    </w:p>
+    <w:p>
+      <w:pPr>
+        <w:pStyle w:val="BodyText"/>
+      </w:pPr>
+      <w:r>
+        <w:t>Fig 1: StudentRegistration.aspx open in Visual Studio showing ASP.NET server controls — Label, TextBox, and Button — that execute on the server before rendering HTML to the browser.</w:t>
+      </w:r>
+    </w:p>
+    <w:p>
+      <w:pPr>
+        <w:pStyle w:val="BodyText"/>
+        <w:rPr>
+          <w:b/>
+          <w:bCs/>
+        </w:rPr>
+      </w:pPr>
+      <w:r>
+        <w:rPr>
+          <w:b/>
+          <w:bCs/>
+        </w:rPr>
+        <w:t xml:space="preserve">Fig 2: Code Behind File – </w:t>
+      </w:r>
+      <w:proofErr w:type="spellStart"/>
+      <w:r>
+        <w:rPr>
+          <w:b/>
+          <w:bCs/>
+        </w:rPr>
+        <w:t>btnSubmit_Click</w:t>
+      </w:r>
+      <w:proofErr w:type="spellEnd"/>
+      <w:r>
+        <w:rPr>
+          <w:b/>
+          <w:bCs/>
+        </w:rPr>
+        <w:t xml:space="preserve"> Event Handler</w:t>
+      </w:r>
+    </w:p>
+    <w:p>
+      <w:pPr>
+        <w:pStyle w:val="BodyText"/>
+        <w:rPr>
+          <w:b/>
+          <w:bCs/>
+        </w:rPr>
+      </w:pPr>
+    </w:p>
+    <w:p>
+      <w:pPr>
+        <w:pStyle w:val="BodyText"/>
+      </w:pPr>
+      <w:r>
+        <w:lastRenderedPageBreak/>
+        <w:drawing>
+          <wp:inline distT="0" distB="0" distL="0" distR="0" wp14:anchorId="7DC8B6FF" wp14:editId="716BA313">
+            <wp:extent cx="4362450" cy="3349447"/>
+            <wp:effectExtent l="0" t="0" r="0" b="0"/>
+            <wp:docPr id="778418743" name="Picture 1"/>
+            <wp:cNvGraphicFramePr>
+              <a:graphicFrameLocks xmlns:a="http://schemas.openxmlformats.org/drawingml/2006/main" noChangeAspect="1"/>
+            </wp:cNvGraphicFramePr>
+            <a:graphic xmlns:a="http://schemas.openxmlformats.org/drawingml/2006/main">
+              <a:graphicData uri="http://schemas.openxmlformats.org/drawingml/2006/picture">
+                <pic:pic xmlns:pic="http://schemas.openxmlformats.org/drawingml/2006/picture">
+                  <pic:nvPicPr>
+                    <pic:cNvPr id="778418743" name=""/>
+                    <pic:cNvPicPr/>
+                  </pic:nvPicPr>
+                  <pic:blipFill>
+                    <a:blip r:embed="rId67"/>
+                    <a:stretch>
+                      <a:fillRect/>
+                    </a:stretch>
+                  </pic:blipFill>
+                  <pic:spPr>
+                    <a:xfrm>
+                      <a:off x="0" y="0"/>
+                      <a:ext cx="4365425" cy="3351731"/>
+                    </a:xfrm>
+                    <a:prstGeom prst="rect">
+                      <a:avLst/>
+                    </a:prstGeom>
+                  </pic:spPr>
+                </pic:pic>
+              </a:graphicData>
+            </a:graphic>
+          </wp:inline>
+        </w:drawing>
+      </w:r>
+    </w:p>
+    <w:p>
+      <w:pPr>
+        <w:pStyle w:val="BodyText"/>
+      </w:pPr>
+      <w:r>
+        <w:t>Fig 2: StudentRegistration.aspx.cs showing the btnSubmit_</w:t>
+      </w:r>
+      <w:proofErr w:type="gramStart"/>
+      <w:r>
+        <w:t>Click(</w:t>
+      </w:r>
+      <w:proofErr w:type="gramEnd"/>
+      <w:r>
+        <w:t>) event handler that reads TextBox values, executes a SQL Server INSERT command using SqlCommand with parameterized queries, and displays a confirmation label.</w:t>
+      </w:r>
+    </w:p>
+    <w:p>
+      <w:pPr>
+        <w:pStyle w:val="BodyText"/>
+        <w:rPr>
+          <w:b/>
+          <w:bCs/>
+        </w:rPr>
+      </w:pPr>
+      <w:r>
+        <w:rPr>
+          <w:b/>
+          <w:bCs/>
+        </w:rPr>
+        <w:t>Fig 3: Login Page with ASP.NET Session Management</w:t>
+      </w:r>
+    </w:p>
+    <w:p>
+      <w:pPr>
+        <w:pStyle w:val="BodyText"/>
+        <w:rPr>
+          <w:b/>
+          <w:bCs/>
+        </w:rPr>
+      </w:pPr>
+      <w:r>
+        <w:rPr>
+          <w:b/>
+          <w:bCs/>
+        </w:rPr>
+        <w:drawing>
+          <wp:inline distT="0" distB="0" distL="0" distR="0" wp14:anchorId="5C56498A" wp14:editId="53717153">
+            <wp:extent cx="4914900" cy="2578308"/>
+            <wp:effectExtent l="0" t="0" r="0" b="0"/>
+            <wp:docPr id="950952263" name="Picture 1"/>
+            <wp:cNvGraphicFramePr>
+              <a:graphicFrameLocks xmlns:a="http://schemas.openxmlformats.org/drawingml/2006/main" noChangeAspect="1"/>
+            </wp:cNvGraphicFramePr>
+            <a:graphic xmlns:a="http://schemas.openxmlformats.org/drawingml/2006/main">
+              <a:graphicData uri="http://schemas.openxmlformats.org/drawingml/2006/picture">
+                <pic:pic xmlns:pic="http://schemas.openxmlformats.org/drawingml/2006/picture">
+                  <pic:nvPicPr>
+                    <pic:cNvPr id="950952263" name=""/>
+                    <pic:cNvPicPr/>
+                  </pic:nvPicPr>
+                  <pic:blipFill>
+                    <a:blip r:embed="rId68"/>
+                    <a:stretch>
+                      <a:fillRect/>
+                    </a:stretch>
+                  </pic:blipFill>
+                  <pic:spPr>
+                    <a:xfrm>
+                      <a:off x="0" y="0"/>
+                      <a:ext cx="4924567" cy="2583379"/>
+                    </a:xfrm>
+                    <a:prstGeom prst="rect">
+                      <a:avLst/>
+                    </a:prstGeom>
+                  </pic:spPr>
+                </pic:pic>
+              </a:graphicData>
+            </a:graphic>
+          </wp:inline>
+        </w:drawing>
+      </w:r>
+    </w:p>
+    <w:p>
+      <w:pPr>
+        <w:pStyle w:val="BodyText"/>
+      </w:pPr>
+      <w:r>
+        <w:lastRenderedPageBreak/>
+        <w:drawing>
+          <wp:inline distT="0" distB="0" distL="0" distR="0" wp14:anchorId="4FD91E6E" wp14:editId="5771471D">
+            <wp:extent cx="4372585" cy="1162212"/>
+            <wp:effectExtent l="0" t="0" r="9525" b="0"/>
+            <wp:docPr id="907799671" name="Picture 1"/>
+            <wp:cNvGraphicFramePr>
+              <a:graphicFrameLocks xmlns:a="http://schemas.openxmlformats.org/drawingml/2006/main" noChangeAspect="1"/>
+            </wp:cNvGraphicFramePr>
+            <a:graphic xmlns:a="http://schemas.openxmlformats.org/drawingml/2006/main">
+              <a:graphicData uri="http://schemas.openxmlformats.org/drawingml/2006/picture">
+                <pic:pic xmlns:pic="http://schemas.openxmlformats.org/drawingml/2006/picture">
+                  <pic:nvPicPr>
+                    <pic:cNvPr id="907799671" name=""/>
+                    <pic:cNvPicPr/>
+                  </pic:nvPicPr>
+                  <pic:blipFill>
+                    <a:blip r:embed="rId69"/>
+                    <a:stretch>
+                      <a:fillRect/>
+                    </a:stretch>
+                  </pic:blipFill>
+                  <pic:spPr>
+                    <a:xfrm>
+                      <a:off x="0" y="0"/>
+                      <a:ext cx="4372585" cy="1162212"/>
+                    </a:xfrm>
+                    <a:prstGeom prst="rect">
+                      <a:avLst/>
+                    </a:prstGeom>
+                  </pic:spPr>
+                </pic:pic>
+              </a:graphicData>
+            </a:graphic>
+          </wp:inline>
+        </w:drawing>
+      </w:r>
+    </w:p>
+    <w:p>
+      <w:pPr>
+        <w:pStyle w:val="BodyText"/>
+      </w:pPr>
+      <w:r>
+        <w:t>Fig 3: Login.aspx displayed in the browser alongside the btnLogin_Click code that sets Session["User"] to the entered username and redirects to Dashboard.aspx — demonstrating ASP.NET session creation after successful login.</w:t>
+      </w:r>
+    </w:p>
+    <w:p>
+      <w:pPr>
+        <w:pStyle w:val="BodyText"/>
+        <w:rPr>
+          <w:b/>
+          <w:bCs/>
+        </w:rPr>
+      </w:pPr>
+      <w:r>
+        <w:rPr>
+          <w:b/>
+          <w:bCs/>
+        </w:rPr>
+        <w:t xml:space="preserve">Fig 4: Dashboard Displaying Session Data and </w:t>
+      </w:r>
+      <w:proofErr w:type="spellStart"/>
+      <w:r>
+        <w:rPr>
+          <w:b/>
+          <w:bCs/>
+        </w:rPr>
+        <w:t>GridView</w:t>
+      </w:r>
+      <w:proofErr w:type="spellEnd"/>
+    </w:p>
+    <w:p>
+      <w:pPr>
+        <w:pStyle w:val="BodyText"/>
+      </w:pPr>
+      <w:r>
+        <w:drawing>
+          <wp:inline distT="0" distB="0" distL="0" distR="0" wp14:anchorId="47897095" wp14:editId="3A907B53">
+            <wp:extent cx="4829175" cy="2482796"/>
+            <wp:effectExtent l="0" t="0" r="0" b="0"/>
+            <wp:docPr id="806753384" name="Picture 1"/>
+            <wp:cNvGraphicFramePr>
+              <a:graphicFrameLocks xmlns:a="http://schemas.openxmlformats.org/drawingml/2006/main" noChangeAspect="1"/>
+            </wp:cNvGraphicFramePr>
+            <a:graphic xmlns:a="http://schemas.openxmlformats.org/drawingml/2006/main">
+              <a:graphicData uri="http://schemas.openxmlformats.org/drawingml/2006/picture">
+                <pic:pic xmlns:pic="http://schemas.openxmlformats.org/drawingml/2006/picture">
+                  <pic:nvPicPr>
+                    <pic:cNvPr id="806753384" name=""/>
+                    <pic:cNvPicPr/>
+                  </pic:nvPicPr>
+                  <pic:blipFill>
+                    <a:blip r:embed="rId70"/>
+                    <a:stretch>
+                      <a:fillRect/>
+                    </a:stretch>
+                  </pic:blipFill>
+                  <pic:spPr>
+                    <a:xfrm>
+                      <a:off x="0" y="0"/>
+                      <a:ext cx="4840673" cy="2488707"/>
+                    </a:xfrm>
+                    <a:prstGeom prst="rect">
+                      <a:avLst/>
+                    </a:prstGeom>
+                  </pic:spPr>
+                </pic:pic>
+              </a:graphicData>
+            </a:graphic>
+          </wp:inline>
+        </w:drawing>
+      </w:r>
+    </w:p>
+    <w:p>
+      <w:pPr>
+        <w:pStyle w:val="BodyText"/>
+      </w:pPr>
+      <w:r>
+        <w:t>Fig 4: Dashboard.aspx displaying the logged-in username retrieved from Session["User"] and a GridView control bound to the StudentDB database showing all registered students.</w:t>
+      </w:r>
+    </w:p>
+    <w:p>
+      <w:pPr>
+        <w:pStyle w:val="BodyText"/>
+        <w:rPr>
+          <w:b/>
+          <w:bCs/>
+          <w:lang w:val="fr-FR"/>
+        </w:rPr>
+      </w:pPr>
+      <w:proofErr w:type="spellStart"/>
+      <w:r>
+        <w:rPr>
+          <w:b/>
+          <w:bCs/>
+          <w:lang w:val="fr-FR"/>
+        </w:rPr>
+        <w:t>Fig</w:t>
+      </w:r>
+      <w:proofErr w:type="spellEnd"/>
+      <w:r>
+        <w:rPr>
+          <w:b/>
+          <w:bCs/>
+          <w:lang w:val="fr-FR"/>
+        </w:rPr>
+        <w:t xml:space="preserve"> </w:t>
+      </w:r>
+      <w:proofErr w:type="gramStart"/>
+      <w:r>
+        <w:rPr>
+          <w:b/>
+          <w:bCs/>
+          <w:lang w:val="fr-FR"/>
+        </w:rPr>
+        <w:t>5:</w:t>
+      </w:r>
+      <w:proofErr w:type="gramEnd"/>
+      <w:r>
+        <w:rPr>
+          <w:b/>
+          <w:bCs/>
+          <w:lang w:val="fr-FR"/>
+        </w:rPr>
+        <w:t xml:space="preserve"> </w:t>
+      </w:r>
+      <w:proofErr w:type="spellStart"/>
+      <w:r>
+        <w:rPr>
+          <w:b/>
+          <w:bCs/>
+          <w:lang w:val="fr-FR"/>
+        </w:rPr>
+        <w:t>Comparison</w:t>
+      </w:r>
+      <w:proofErr w:type="spellEnd"/>
+      <w:r>
+        <w:rPr>
+          <w:b/>
+          <w:bCs/>
+          <w:lang w:val="fr-FR"/>
+        </w:rPr>
+        <w:t xml:space="preserve"> – ASP.NET, Java, and PHP Session Management Code</w:t>
+      </w:r>
+    </w:p>
+    <w:p>
+      <w:pPr>
+        <w:pStyle w:val="BodyText"/>
+        <w:rPr>
+          <w:lang w:val="fr-FR"/>
+        </w:rPr>
+      </w:pPr>
+      <w:r>
+        <w:rPr>
+          <w:lang w:val="fr-FR"/>
+        </w:rPr>
+        <w:lastRenderedPageBreak/>
+        <w:drawing>
+          <wp:inline distT="0" distB="0" distL="0" distR="0" wp14:anchorId="52C1FFCA" wp14:editId="38958AA3">
+            <wp:extent cx="4371975" cy="3137950"/>
+            <wp:effectExtent l="0" t="0" r="0" b="0"/>
+            <wp:docPr id="1786406271" name="Picture 1"/>
+            <wp:cNvGraphicFramePr>
+              <a:graphicFrameLocks xmlns:a="http://schemas.openxmlformats.org/drawingml/2006/main" noChangeAspect="1"/>
+            </wp:cNvGraphicFramePr>
+            <a:graphic xmlns:a="http://schemas.openxmlformats.org/drawingml/2006/main">
+              <a:graphicData uri="http://schemas.openxmlformats.org/drawingml/2006/picture">
+                <pic:pic xmlns:pic="http://schemas.openxmlformats.org/drawingml/2006/picture">
+                  <pic:nvPicPr>
+                    <pic:cNvPr id="1786406271" name=""/>
+                    <pic:cNvPicPr/>
+                  </pic:nvPicPr>
+                  <pic:blipFill>
+                    <a:blip r:embed="rId71"/>
+                    <a:stretch>
+                      <a:fillRect/>
+                    </a:stretch>
+                  </pic:blipFill>
+                  <pic:spPr>
+                    <a:xfrm>
+                      <a:off x="0" y="0"/>
+                      <a:ext cx="4381645" cy="3144891"/>
+                    </a:xfrm>
+                    <a:prstGeom prst="rect">
+                      <a:avLst/>
+                    </a:prstGeom>
+                  </pic:spPr>
+                </pic:pic>
+              </a:graphicData>
+            </a:graphic>
+          </wp:inline>
+        </w:drawing>
+      </w:r>
+    </w:p>
+    <w:p>
+      <w:pPr>
+        <w:pStyle w:val="BodyText"/>
+      </w:pPr>
+      <w:r>
+        <w:t>Fig 5: Side-by-side code comparison showing Session["User</w:t>
+      </w:r>
+      <w:proofErr w:type="gramStart"/>
+      <w:r>
+        <w:t>"]=</w:t>
+      </w:r>
+      <w:proofErr w:type="gramEnd"/>
+      <w:r>
+        <w:t xml:space="preserve">"Michael" in ASP.NET C#, </w:t>
+      </w:r>
+      <w:proofErr w:type="gramStart"/>
+      <w:r>
+        <w:t>session.setAttribute</w:t>
+      </w:r>
+      <w:proofErr w:type="gramEnd"/>
+      <w:r>
+        <w:t>("user","Michael") in Java, and $_SESSION["user</w:t>
+      </w:r>
+      <w:proofErr w:type="gramStart"/>
+      <w:r>
+        <w:t>"]=</w:t>
+      </w:r>
+      <w:proofErr w:type="gramEnd"/>
+      <w:r>
+        <w:t>"Michael" in PHP — demonstrating that all three frameworks implement the same session concept using different syntax.</w:t>
+      </w:r>
+    </w:p>
+    <w:p>
+      <w:pPr>
+        <w:pStyle w:val="BodyText"/>
+      </w:pPr>
+      <w:r>
+        <w:rPr>
+          <w:b/>
+          <w:bCs/>
+        </w:rPr>
+        <w:t xml:space="preserve">Student Reflection </w:t>
+      </w:r>
+    </w:p>
+    <w:p>
+      <w:pPr>
+        <w:pStyle w:val="BodyText"/>
+      </w:pPr>
+      <w:r>
+        <w:t>This week I explored ASP.NET Web Forms as a third approach to web development alongside Java Servlets and Node.js. Fig 1 showed how ASP.NET server controls like TextBox and Button render HTML on the client but execute logic on the server — the event-driven model in Fig 2 was immediately familiar from Java, where a button click triggers a specific method. The login and session management in Fig 3 mirrors exactly what I built in Node.js (Week 7) and Java (Week 9) — the syntax is different but the concept is identical, as confirmed by the comparison in Fig 5. Fig 4 showed the GridView control, which is a powerful ASP.NET feature that automatically renders a database table as formatted HTML with minimal code — something that required more manual work in JSP and EJS. This week reinforced that the fundamental concepts of web development — forms, sessions, database connectivity, and event handling — are universal across all frameworks.</w:t>
+      </w:r>
+    </w:p>
+    <w:p>
+      <w:pPr>
+        <w:pStyle w:val="BodyText"/>
+        <w:rPr>
+          <w:i/>
+          <w:iCs/>
+        </w:rPr>
+      </w:pPr>
+      <w:r>
+        <w:rPr>
+          <w:i/>
+          <w:iCs/>
+        </w:rPr>
+        <w:t>BIT3208 – Advanced Web Design and Development</w:t>
+      </w:r>
+    </w:p>
+    <w:p>
+      <w:pPr>
+        <w:pStyle w:val="BodyText"/>
+        <w:rPr>
+          <w:i/>
+          <w:iCs/>
+        </w:rPr>
+      </w:pPr>
+      <w:r>
+        <w:rPr>
+          <w:i/>
+          <w:iCs/>
+        </w:rPr>
+        <w:t>Student: Marciah Muringi Gichohi | Admission No: BSCCS/2024/53659</w:t>
+      </w:r>
+    </w:p>
+    <w:p>
+      <w:pPr>
+        <w:pStyle w:val="BodyText"/>
+      </w:pPr>
+    </w:p>
+    <w:p>
+      <w:pPr>
+        <w:pStyle w:val="BodyText"/>
+      </w:pPr>
+      <w:r>
+        <w:rPr>
+          <w:b/>
+          <w:bCs/>
+        </w:rPr>
+        <w:t>WEEK 13: Special Topics – COM, CORBA, RMI, LDAP, and Search Engines</w:t>
+      </w:r>
+    </w:p>
+    <w:p>
+      <w:pPr>
+        <w:pStyle w:val="BodyText"/>
+      </w:pPr>
+      <w:r>
+        <w:rPr>
+          <w:b/>
+          <w:bCs/>
+        </w:rPr>
+        <w:t xml:space="preserve">Title: </w:t>
+      </w:r>
+      <w:r>
+        <w:t>Enterprise Web Technologies – Authentication and Search Integration</w:t>
+      </w:r>
+    </w:p>
+    <w:p>
+      <w:pPr>
+        <w:pStyle w:val="BodyText"/>
+        <w:rPr>
+          <w:b/>
+          <w:bCs/>
+        </w:rPr>
+      </w:pPr>
+      <w:r>
+        <w:rPr>
+          <w:b/>
+          <w:bCs/>
+        </w:rPr>
+        <w:t>Fig 1: Enterprise Technologies Comparison Table</w:t>
+      </w:r>
+    </w:p>
+    <w:p>
+      <w:pPr>
+        <w:pStyle w:val="BodyText"/>
+      </w:pPr>
+      <w:r>
+        <w:lastRenderedPageBreak/>
+        <w:drawing>
+          <wp:inline distT="0" distB="0" distL="0" distR="0" wp14:anchorId="41BDA0B5" wp14:editId="0271F7EE">
+            <wp:extent cx="3657600" cy="2556301"/>
+            <wp:effectExtent l="0" t="0" r="0" b="0"/>
+            <wp:docPr id="728005757" name="Picture 1"/>
+            <wp:cNvGraphicFramePr>
+              <a:graphicFrameLocks xmlns:a="http://schemas.openxmlformats.org/drawingml/2006/main" noChangeAspect="1"/>
+            </wp:cNvGraphicFramePr>
+            <a:graphic xmlns:a="http://schemas.openxmlformats.org/drawingml/2006/main">
+              <a:graphicData uri="http://schemas.openxmlformats.org/drawingml/2006/picture">
+                <pic:pic xmlns:pic="http://schemas.openxmlformats.org/drawingml/2006/picture">
+                  <pic:nvPicPr>
+                    <pic:cNvPr id="728005757" name=""/>
+                    <pic:cNvPicPr/>
+                  </pic:nvPicPr>
+                  <pic:blipFill>
+                    <a:blip r:embed="rId72"/>
+                    <a:stretch>
+                      <a:fillRect/>
+                    </a:stretch>
+                  </pic:blipFill>
+                  <pic:spPr>
+                    <a:xfrm>
+                      <a:off x="0" y="0"/>
+                      <a:ext cx="3664728" cy="2561283"/>
+                    </a:xfrm>
+                    <a:prstGeom prst="rect">
+                      <a:avLst/>
+                    </a:prstGeom>
+                  </pic:spPr>
+                </pic:pic>
+              </a:graphicData>
+            </a:graphic>
+          </wp:inline>
+        </w:drawing>
+      </w:r>
+    </w:p>
+    <w:p>
+      <w:pPr>
+        <w:pStyle w:val="BodyText"/>
+      </w:pPr>
+      <w:r>
+        <w:t>Fig 1: Comparison table summarizing COM (Windows component integration), CORBA (cross-language distributed communication), RMI (Java-to-Java remote methods), LDAP (centralized directory authentication), and Elasticsearch (fast full-text search) — showing their primary purposes and use cases.</w:t>
+      </w:r>
+    </w:p>
+    <w:p>
+      <w:pPr>
+        <w:pStyle w:val="BodyText"/>
+        <w:rPr>
+          <w:b/>
+          <w:bCs/>
+        </w:rPr>
+      </w:pPr>
+      <w:r>
+        <w:rPr>
+          <w:b/>
+          <w:bCs/>
+        </w:rPr>
+        <w:t>Fig 2: LDAP Directory Structure Diagram</w:t>
+      </w:r>
+    </w:p>
+    <w:p>
+      <w:pPr>
+        <w:pStyle w:val="BodyText"/>
+      </w:pPr>
+      <w:r>
+        <w:drawing>
+          <wp:inline distT="0" distB="0" distL="0" distR="0" wp14:anchorId="6C40ED14" wp14:editId="11D3F9E6">
+            <wp:extent cx="2962688" cy="2943636"/>
+            <wp:effectExtent l="0" t="0" r="0" b="9525"/>
+            <wp:docPr id="5848107" name="Picture 1"/>
+            <wp:cNvGraphicFramePr>
+              <a:graphicFrameLocks xmlns:a="http://schemas.openxmlformats.org/drawingml/2006/main" noChangeAspect="1"/>
+            </wp:cNvGraphicFramePr>
+            <a:graphic xmlns:a="http://schemas.openxmlformats.org/drawingml/2006/main">
+              <a:graphicData uri="http://schemas.openxmlformats.org/drawingml/2006/picture">
+                <pic:pic xmlns:pic="http://schemas.openxmlformats.org/drawingml/2006/picture">
+                  <pic:nvPicPr>
+                    <pic:cNvPr id="5848107" name=""/>
+                    <pic:cNvPicPr/>
+                  </pic:nvPicPr>
+                  <pic:blipFill>
+                    <a:blip r:embed="rId73"/>
+                    <a:stretch>
+                      <a:fillRect/>
+                    </a:stretch>
+                  </pic:blipFill>
+                  <pic:spPr>
+                    <a:xfrm>
+                      <a:off x="0" y="0"/>
+                      <a:ext cx="2962688" cy="2943636"/>
+                    </a:xfrm>
+                    <a:prstGeom prst="rect">
+                      <a:avLst/>
+                    </a:prstGeom>
+                  </pic:spPr>
+                </pic:pic>
+              </a:graphicData>
+            </a:graphic>
+          </wp:inline>
+        </w:drawing>
+      </w:r>
+    </w:p>
+    <w:p>
+      <w:pPr>
+        <w:pStyle w:val="BodyText"/>
+      </w:pPr>
+      <w:r>
+        <w:t>Fig 2: LDAP directory tree diagram showing the hierarchical structure of the university directory — Organization at the root, branching into departments, then individual users and groups, illustrating how LDAP organizes authentication data centrally.</w:t>
+      </w:r>
+    </w:p>
+    <w:p>
+      <w:pPr>
+        <w:pStyle w:val="BodyText"/>
+        <w:rPr>
+          <w:b/>
+          <w:bCs/>
+        </w:rPr>
+      </w:pPr>
+      <w:r>
+        <w:rPr>
+          <w:b/>
+          <w:bCs/>
+        </w:rPr>
+        <w:t>Fig 3: Simulated LDAP Login Page</w:t>
+      </w:r>
+    </w:p>
+    <w:p>
+      <w:pPr>
+        <w:pStyle w:val="BodyText"/>
+        <w:rPr>
+          <w:b/>
+          <w:bCs/>
+        </w:rPr>
+      </w:pPr>
+    </w:p>
+    <w:p>
+      <w:pPr>
+        <w:pStyle w:val="BodyText"/>
+      </w:pPr>
+      <w:r>
+        <w:lastRenderedPageBreak/>
+        <w:drawing>
+          <wp:inline distT="0" distB="0" distL="0" distR="0" wp14:anchorId="33D6B27F" wp14:editId="2F65A6C5">
+            <wp:extent cx="5067300" cy="2172551"/>
+            <wp:effectExtent l="0" t="0" r="0" b="0"/>
+            <wp:docPr id="605397845" name="Picture 1"/>
+            <wp:cNvGraphicFramePr>
+              <a:graphicFrameLocks xmlns:a="http://schemas.openxmlformats.org/drawingml/2006/main" noChangeAspect="1"/>
+            </wp:cNvGraphicFramePr>
+            <a:graphic xmlns:a="http://schemas.openxmlformats.org/drawingml/2006/main">
+              <a:graphicData uri="http://schemas.openxmlformats.org/drawingml/2006/picture">
+                <pic:pic xmlns:pic="http://schemas.openxmlformats.org/drawingml/2006/picture">
+                  <pic:nvPicPr>
+                    <pic:cNvPr id="605397845" name=""/>
+                    <pic:cNvPicPr/>
+                  </pic:nvPicPr>
+                  <pic:blipFill>
+                    <a:blip r:embed="rId74"/>
+                    <a:stretch>
+                      <a:fillRect/>
+                    </a:stretch>
+                  </pic:blipFill>
+                  <pic:spPr>
+                    <a:xfrm>
+                      <a:off x="0" y="0"/>
+                      <a:ext cx="5073507" cy="2175212"/>
+                    </a:xfrm>
+                    <a:prstGeom prst="rect">
+                      <a:avLst/>
+                    </a:prstGeom>
+                  </pic:spPr>
+                </pic:pic>
+              </a:graphicData>
+            </a:graphic>
+          </wp:inline>
+        </w:drawing>
+      </w:r>
+    </w:p>
+    <w:p>
+      <w:pPr>
+        <w:pStyle w:val="BodyText"/>
+      </w:pPr>
+      <w:r>
+        <w:t>Fig 3: Login page for the Student Management System simulating LDAP authentication — users are verified against a centralized directory rather than credentials stored in the application database, demonstrating separation of authentication from application data.</w:t>
+      </w:r>
+    </w:p>
+    <w:p>
+      <w:pPr>
+        <w:pStyle w:val="BodyText"/>
+        <w:rPr>
+          <w:b/>
+          <w:bCs/>
+        </w:rPr>
+      </w:pPr>
+      <w:r>
+        <w:rPr>
+          <w:b/>
+          <w:bCs/>
+        </w:rPr>
+        <w:t>Fig 4: Student Search Feature with Dynamic Results</w:t>
+      </w:r>
+    </w:p>
+    <w:p>
+      <w:pPr>
+        <w:pStyle w:val="BodyText"/>
+      </w:pPr>
+      <w:r>
+        <w:drawing>
+          <wp:inline distT="0" distB="0" distL="0" distR="0" wp14:anchorId="3008246E" wp14:editId="609F6BA5">
+            <wp:extent cx="3638550" cy="4394352"/>
+            <wp:effectExtent l="0" t="0" r="0" b="0"/>
+            <wp:docPr id="294169398" name="Picture 1"/>
+            <wp:cNvGraphicFramePr>
+              <a:graphicFrameLocks xmlns:a="http://schemas.openxmlformats.org/drawingml/2006/main" noChangeAspect="1"/>
+            </wp:cNvGraphicFramePr>
+            <a:graphic xmlns:a="http://schemas.openxmlformats.org/drawingml/2006/main">
+              <a:graphicData uri="http://schemas.openxmlformats.org/drawingml/2006/picture">
+                <pic:pic xmlns:pic="http://schemas.openxmlformats.org/drawingml/2006/picture">
+                  <pic:nvPicPr>
+                    <pic:cNvPr id="294169398" name=""/>
+                    <pic:cNvPicPr/>
+                  </pic:nvPicPr>
+                  <pic:blipFill>
+                    <a:blip r:embed="rId75"/>
+                    <a:stretch>
+                      <a:fillRect/>
+                    </a:stretch>
+                  </pic:blipFill>
+                  <pic:spPr>
+                    <a:xfrm>
+                      <a:off x="0" y="0"/>
+                      <a:ext cx="3641186" cy="4397535"/>
+                    </a:xfrm>
+                    <a:prstGeom prst="rect">
+                      <a:avLst/>
+                    </a:prstGeom>
+                  </pic:spPr>
+                </pic:pic>
+              </a:graphicData>
+            </a:graphic>
+          </wp:inline>
+        </w:drawing>
+      </w:r>
+    </w:p>
+    <w:p>
+      <w:pPr>
+        <w:pStyle w:val="BodyText"/>
+      </w:pPr>
+      <w:r>
+        <w:lastRenderedPageBreak/>
+        <w:t>Fig 4: Student Management System search page displaying filtered results by name, registration number, or course — demonstrating dynamic record retrieval similar to how search engines index and retrieve content from large datasets.</w:t>
+      </w:r>
+    </w:p>
+    <w:p>
+      <w:pPr>
+        <w:pStyle w:val="BodyText"/>
+        <w:rPr>
+          <w:b/>
+          <w:bCs/>
+        </w:rPr>
+      </w:pPr>
+      <w:r>
+        <w:rPr>
+          <w:b/>
+          <w:bCs/>
+        </w:rPr>
+        <w:t>Fig 5: Enterprise Architecture Diagram – Portal, LDAP, Database, and Elasticsearch</w:t>
+      </w:r>
+    </w:p>
+    <w:p>
+      <w:pPr>
+        <w:pStyle w:val="BodyText"/>
+      </w:pPr>
+      <w:r>
+        <w:drawing>
+          <wp:inline distT="0" distB="0" distL="0" distR="0" wp14:anchorId="3E0651D5" wp14:editId="4E27A493">
+            <wp:extent cx="5943600" cy="1167130"/>
+            <wp:effectExtent l="0" t="0" r="0" b="0"/>
+            <wp:docPr id="1483725083" name="Picture 1"/>
+            <wp:cNvGraphicFramePr>
+              <a:graphicFrameLocks xmlns:a="http://schemas.openxmlformats.org/drawingml/2006/main" noChangeAspect="1"/>
+            </wp:cNvGraphicFramePr>
+            <a:graphic xmlns:a="http://schemas.openxmlformats.org/drawingml/2006/main">
+              <a:graphicData uri="http://schemas.openxmlformats.org/drawingml/2006/picture">
+                <pic:pic xmlns:pic="http://schemas.openxmlformats.org/drawingml/2006/picture">
+                  <pic:nvPicPr>
+                    <pic:cNvPr id="1483725083" name=""/>
+                    <pic:cNvPicPr/>
+                  </pic:nvPicPr>
+                  <pic:blipFill>
+                    <a:blip r:embed="rId76"/>
+                    <a:stretch>
+                      <a:fillRect/>
+                    </a:stretch>
+                  </pic:blipFill>
+                  <pic:spPr>
+                    <a:xfrm>
+                      <a:off x="0" y="0"/>
+                      <a:ext cx="5943600" cy="1167130"/>
+                    </a:xfrm>
+                    <a:prstGeom prst="rect">
+                      <a:avLst/>
+                    </a:prstGeom>
+                  </pic:spPr>
+                </pic:pic>
+              </a:graphicData>
+            </a:graphic>
+          </wp:inline>
+        </w:drawing>
+      </w:r>
+    </w:p>
+    <w:p>
+      <w:pPr>
+        <w:pStyle w:val="BodyText"/>
+      </w:pPr>
+      <w:r>
+        <w:t>Fig 5: Enterprise architecture diagram showing a Student Portal connecting to OpenLDAP for authentication, a MySQL database for data storage, and Elasticsearch for fast student search — representing how large organizations integrate multiple specialized technologies.</w:t>
+      </w:r>
+    </w:p>
+    <w:p>
+      <w:pPr>
+        <w:pStyle w:val="BodyText"/>
+      </w:pPr>
+      <w:r>
+        <w:rPr>
+          <w:b/>
+          <w:bCs/>
+        </w:rPr>
+        <w:t xml:space="preserve">Student Reflection </w:t>
+      </w:r>
+    </w:p>
+    <w:p>
+      <w:pPr>
+        <w:pStyle w:val="BodyText"/>
+      </w:pPr>
+      <w:r>
+        <w:t>This week I studied enterprise technologies that power large-scale web systems. Fig 1 summarized the five key technologies — COM handles Windows application integration, CORBA enables cross-language communication, RMI connects Java applications across networks, LDAP centralizes user authentication, and Elasticsearch provides fast full-text search. The comparison showed that each technology solves a specific problem in distributed systems. The LDAP structure in Fig 2 explained why universities and hospitals use directory services instead of storing usernames in every application separately — one central directory manages all accounts, improving security and simplifying administration. Fig 3 simulated this in the Student Management System by separating authentication from application data. Fig 4 added a search feature using SQL LIKE queries as a simplified version of what Elasticsearch provides at scale. Fig 5 brought everything together in an enterprise architecture showing how a real student portal would integrate all these technologies. This week helped me understand the difference between building a small web application and designing enterprise-grade systems.</w:t>
+      </w:r>
+    </w:p>
+    <w:p>
+      <w:pPr>
+        <w:pStyle w:val="BodyText"/>
+        <w:rPr>
+          <w:i/>
+          <w:iCs/>
+        </w:rPr>
+      </w:pPr>
+      <w:r>
+        <w:rPr>
+          <w:i/>
+          <w:iCs/>
+        </w:rPr>
+        <w:t>BIT3208 – Advanced Web Design and Development</w:t>
+      </w:r>
+    </w:p>
+    <w:p>
+      <w:pPr>
+        <w:pStyle w:val="BodyText"/>
+        <w:rPr>
+          <w:i/>
+          <w:iCs/>
+        </w:rPr>
+      </w:pPr>
+      <w:r>
+        <w:rPr>
+          <w:i/>
+          <w:iCs/>
+        </w:rPr>
+        <w:t>Student: Marciah Muringi Gichohi | Admission No: BSCCS/2024/53659</w:t>
+      </w:r>
+    </w:p>
+    <w:p>
+      <w:pPr>
+        <w:pStyle w:val="BodyText"/>
+      </w:pPr>
+    </w:p>
+    <w:p>
+      <w:pPr>
+        <w:pStyle w:val="BodyText"/>
+      </w:pPr>
+      <w:r>
+        <w:rPr>
+          <w:b/>
+          <w:bCs/>
+        </w:rPr>
+        <w:t>WEEK 14: Website Testing, Publishing, and Maintenance</w:t>
+      </w:r>
+    </w:p>
+    <w:p>
+      <w:pPr>
+        <w:pStyle w:val="BodyText"/>
+      </w:pPr>
+      <w:r>
+        <w:rPr>
+          <w:b/>
+          <w:bCs/>
+        </w:rPr>
+        <w:t xml:space="preserve">Title: </w:t>
+      </w:r>
+      <w:r>
+        <w:t>Deploying, Testing, and Maintaining the SmartShop Web Application</w:t>
+      </w:r>
+    </w:p>
+    <w:p>
+      <w:pPr>
+        <w:pStyle w:val="BodyText"/>
+        <w:rPr>
+          <w:b/>
+          <w:bCs/>
+        </w:rPr>
+      </w:pPr>
+      <w:r>
+        <w:rPr>
+          <w:b/>
+          <w:bCs/>
+        </w:rPr>
+        <w:t xml:space="preserve">Fig 1: Manual Testing Checklist – </w:t>
+      </w:r>
+      <w:proofErr w:type="spellStart"/>
+      <w:r>
+        <w:rPr>
+          <w:b/>
+          <w:bCs/>
+        </w:rPr>
+        <w:t>SmartShop</w:t>
+      </w:r>
+      <w:proofErr w:type="spellEnd"/>
+      <w:r>
+        <w:rPr>
+          <w:b/>
+          <w:bCs/>
+        </w:rPr>
+        <w:t xml:space="preserve"> Features</w:t>
+      </w:r>
+    </w:p>
+    <w:p>
+      <w:pPr>
+        <w:pStyle w:val="BodyText"/>
+      </w:pPr>
+      <w:r>
+        <w:lastRenderedPageBreak/>
+        <w:drawing>
+          <wp:inline distT="0" distB="0" distL="0" distR="0" wp14:anchorId="119BAAF4" wp14:editId="7F59834B">
+            <wp:extent cx="1885950" cy="2442824"/>
+            <wp:effectExtent l="0" t="0" r="0" b="0"/>
+            <wp:docPr id="526602900" name="Picture 1"/>
+            <wp:cNvGraphicFramePr>
+              <a:graphicFrameLocks xmlns:a="http://schemas.openxmlformats.org/drawingml/2006/main" noChangeAspect="1"/>
+            </wp:cNvGraphicFramePr>
+            <a:graphic xmlns:a="http://schemas.openxmlformats.org/drawingml/2006/main">
+              <a:graphicData uri="http://schemas.openxmlformats.org/drawingml/2006/picture">
+                <pic:pic xmlns:pic="http://schemas.openxmlformats.org/drawingml/2006/picture">
+                  <pic:nvPicPr>
+                    <pic:cNvPr id="526602900" name=""/>
+                    <pic:cNvPicPr/>
+                  </pic:nvPicPr>
+                  <pic:blipFill>
+                    <a:blip r:embed="rId77"/>
+                    <a:stretch>
+                      <a:fillRect/>
+                    </a:stretch>
+                  </pic:blipFill>
+                  <pic:spPr>
+                    <a:xfrm>
+                      <a:off x="0" y="0"/>
+                      <a:ext cx="1887178" cy="2444415"/>
+                    </a:xfrm>
+                    <a:prstGeom prst="rect">
+                      <a:avLst/>
+                    </a:prstGeom>
+                  </pic:spPr>
+                </pic:pic>
+              </a:graphicData>
+            </a:graphic>
+          </wp:inline>
+        </w:drawing>
+      </w:r>
+    </w:p>
+    <w:p>
+      <w:pPr>
+        <w:pStyle w:val="BodyText"/>
+      </w:pPr>
+      <w:r>
+        <w:t>Fig 1: Manual testing checklist for SmartShop showing test cases for login, logout, registration, database connection, product search, update, delete, session management, error handling, and responsive layout — each marked as Pass after verification.</w:t>
+      </w:r>
+    </w:p>
+    <w:p>
+      <w:pPr>
+        <w:pStyle w:val="BodyText"/>
+        <w:rPr>
+          <w:b/>
+          <w:bCs/>
+        </w:rPr>
+      </w:pPr>
+      <w:r>
+        <w:rPr>
+          <w:b/>
+          <w:bCs/>
+        </w:rPr>
+        <w:t>Fig 2: GitHub Repository Showing Full Project History</w:t>
+      </w:r>
+    </w:p>
+    <w:p>
+      <w:pPr>
+        <w:pStyle w:val="BodyText"/>
+      </w:pPr>
+      <w:r>
+        <w:drawing>
+          <wp:inline distT="0" distB="0" distL="0" distR="0" wp14:anchorId="6EB79666" wp14:editId="1D762A0F">
+            <wp:extent cx="4791075" cy="2650447"/>
+            <wp:effectExtent l="0" t="0" r="0" b="0"/>
+            <wp:docPr id="1135685547" name="Picture 1"/>
+            <wp:cNvGraphicFramePr>
+              <a:graphicFrameLocks xmlns:a="http://schemas.openxmlformats.org/drawingml/2006/main" noChangeAspect="1"/>
+            </wp:cNvGraphicFramePr>
+            <a:graphic xmlns:a="http://schemas.openxmlformats.org/drawingml/2006/main">
+              <a:graphicData uri="http://schemas.openxmlformats.org/drawingml/2006/picture">
+                <pic:pic xmlns:pic="http://schemas.openxmlformats.org/drawingml/2006/picture">
+                  <pic:nvPicPr>
+                    <pic:cNvPr id="1135685547" name=""/>
+                    <pic:cNvPicPr/>
+                  </pic:nvPicPr>
+                  <pic:blipFill>
+                    <a:blip r:embed="rId78"/>
+                    <a:stretch>
+                      <a:fillRect/>
+                    </a:stretch>
+                  </pic:blipFill>
+                  <pic:spPr>
+                    <a:xfrm>
+                      <a:off x="0" y="0"/>
+                      <a:ext cx="4797249" cy="2653863"/>
+                    </a:xfrm>
+                    <a:prstGeom prst="rect">
+                      <a:avLst/>
+                    </a:prstGeom>
+                  </pic:spPr>
+                </pic:pic>
+              </a:graphicData>
+            </a:graphic>
+          </wp:inline>
+        </w:drawing>
+      </w:r>
+    </w:p>
+    <w:p>
+      <w:pPr>
+        <w:pStyle w:val="BodyText"/>
+      </w:pPr>
+      <w:r>
+        <w:t>Fig 2: SmartShop GitHub repository at https://github.com/gichohimarciah-hub/smartshop-bit3208 showing the full commit history with meaningful commit messages documenting each week's development progress.</w:t>
+      </w:r>
+    </w:p>
+    <w:p>
+      <w:pPr>
+        <w:pStyle w:val="BodyText"/>
+        <w:rPr>
+          <w:b/>
+          <w:bCs/>
+        </w:rPr>
+      </w:pPr>
+      <w:r>
+        <w:rPr>
+          <w:b/>
+          <w:bCs/>
+        </w:rPr>
+        <w:t>Fig 3: Git Commit and Push Commands in VS Code Terminal</w:t>
+      </w:r>
+    </w:p>
+    <w:p>
+      <w:pPr>
+        <w:pStyle w:val="BodyText"/>
+      </w:pPr>
+      <w:r>
+        <w:lastRenderedPageBreak/>
+        <w:drawing>
+          <wp:inline distT="0" distB="0" distL="0" distR="0" wp14:anchorId="28E1EC1B" wp14:editId="1C5CB5A5">
+            <wp:extent cx="4739295" cy="2124075"/>
+            <wp:effectExtent l="0" t="0" r="0" b="0"/>
+            <wp:docPr id="2101415773" name="Picture 1"/>
+            <wp:cNvGraphicFramePr>
+              <a:graphicFrameLocks xmlns:a="http://schemas.openxmlformats.org/drawingml/2006/main" noChangeAspect="1"/>
+            </wp:cNvGraphicFramePr>
+            <a:graphic xmlns:a="http://schemas.openxmlformats.org/drawingml/2006/main">
+              <a:graphicData uri="http://schemas.openxmlformats.org/drawingml/2006/picture">
+                <pic:pic xmlns:pic="http://schemas.openxmlformats.org/drawingml/2006/picture">
+                  <pic:nvPicPr>
+                    <pic:cNvPr id="2101415773" name=""/>
+                    <pic:cNvPicPr/>
+                  </pic:nvPicPr>
+                  <pic:blipFill>
+                    <a:blip r:embed="rId79"/>
+                    <a:stretch>
+                      <a:fillRect/>
+                    </a:stretch>
+                  </pic:blipFill>
+                  <pic:spPr>
+                    <a:xfrm>
+                      <a:off x="0" y="0"/>
+                      <a:ext cx="4742818" cy="2125654"/>
+                    </a:xfrm>
+                    <a:prstGeom prst="rect">
+                      <a:avLst/>
+                    </a:prstGeom>
+                  </pic:spPr>
+                </pic:pic>
+              </a:graphicData>
+            </a:graphic>
+          </wp:inline>
+        </w:drawing>
+      </w:r>
+    </w:p>
+    <w:p>
+      <w:pPr>
+        <w:pStyle w:val="BodyText"/>
+      </w:pPr>
+      <w:r>
+        <w:t>Fig 3: VS Code terminal showing the git add, git commit, and git push commands used to version-control SmartShop throughout the semester — demonstrating the complete Git workflow from staging changes to pushing to the remote GitHub repository.</w:t>
+      </w:r>
+    </w:p>
+    <w:p>
+      <w:pPr>
+        <w:pStyle w:val="BodyText"/>
+        <w:rPr>
+          <w:b/>
+          <w:bCs/>
+        </w:rPr>
+      </w:pPr>
+      <w:r>
+        <w:rPr>
+          <w:b/>
+          <w:bCs/>
+        </w:rPr>
+        <w:t>Fig 4: SmartShop Running Successfully on localhost:3000</w:t>
+      </w:r>
+    </w:p>
+    <w:p>
+      <w:pPr>
+        <w:pStyle w:val="BodyText"/>
+      </w:pPr>
+      <w:r>
+        <w:drawing>
+          <wp:inline distT="0" distB="0" distL="0" distR="0" wp14:anchorId="77075E88" wp14:editId="6C6E0497">
+            <wp:extent cx="5943600" cy="2112010"/>
+            <wp:effectExtent l="0" t="0" r="0" b="0"/>
+            <wp:docPr id="1250541583" name="Picture 1"/>
+            <wp:cNvGraphicFramePr>
+              <a:graphicFrameLocks xmlns:a="http://schemas.openxmlformats.org/drawingml/2006/main" noChangeAspect="1"/>
+            </wp:cNvGraphicFramePr>
+            <a:graphic xmlns:a="http://schemas.openxmlformats.org/drawingml/2006/main">
+              <a:graphicData uri="http://schemas.openxmlformats.org/drawingml/2006/picture">
+                <pic:pic xmlns:pic="http://schemas.openxmlformats.org/drawingml/2006/picture">
+                  <pic:nvPicPr>
+                    <pic:cNvPr id="1250541583" name=""/>
+                    <pic:cNvPicPr/>
+                  </pic:nvPicPr>
+                  <pic:blipFill>
+                    <a:blip r:embed="rId80"/>
+                    <a:stretch>
+                      <a:fillRect/>
+                    </a:stretch>
+                  </pic:blipFill>
+                  <pic:spPr>
+                    <a:xfrm>
+                      <a:off x="0" y="0"/>
+                      <a:ext cx="5943600" cy="2112010"/>
+                    </a:xfrm>
+                    <a:prstGeom prst="rect">
+                      <a:avLst/>
+                    </a:prstGeom>
+                  </pic:spPr>
+                </pic:pic>
+              </a:graphicData>
+            </a:graphic>
+          </wp:inline>
+        </w:drawing>
+      </w:r>
+    </w:p>
+    <w:p>
+      <w:pPr>
+        <w:pStyle w:val="BodyText"/>
+      </w:pPr>
+      <w:r>
+        <w:t>Fig 4: SmartShop home page running at localhost:3000 showing the complete deployed application with navigation, hero section, and product grid — confirming all components are integrated and the application is ready for deployment.</w:t>
+      </w:r>
+    </w:p>
+    <w:p>
+      <w:pPr>
+        <w:pStyle w:val="BodyText"/>
+        <w:rPr>
+          <w:b/>
+          <w:bCs/>
+        </w:rPr>
+      </w:pPr>
+      <w:r>
+        <w:rPr>
+          <w:b/>
+          <w:bCs/>
+        </w:rPr>
+        <w:t>Fig 5: Security Checklist Before Deployment</w:t>
+      </w:r>
+    </w:p>
+    <w:p>
+      <w:pPr>
+        <w:pStyle w:val="BodyText"/>
+      </w:pPr>
+      <w:r>
+        <w:drawing>
+          <wp:inline distT="0" distB="0" distL="0" distR="0" wp14:anchorId="0365E920" wp14:editId="6D813906">
+            <wp:extent cx="3562350" cy="1514475"/>
+            <wp:effectExtent l="0" t="0" r="0" b="0"/>
+            <wp:docPr id="633831043" name="Picture 1"/>
+            <wp:cNvGraphicFramePr>
+              <a:graphicFrameLocks xmlns:a="http://schemas.openxmlformats.org/drawingml/2006/main" noChangeAspect="1"/>
+            </wp:cNvGraphicFramePr>
+            <a:graphic xmlns:a="http://schemas.openxmlformats.org/drawingml/2006/main">
+              <a:graphicData uri="http://schemas.openxmlformats.org/drawingml/2006/picture">
+                <pic:pic xmlns:pic="http://schemas.openxmlformats.org/drawingml/2006/picture">
+                  <pic:nvPicPr>
+                    <pic:cNvPr id="633831043" name=""/>
+                    <pic:cNvPicPr/>
+                  </pic:nvPicPr>
+                  <pic:blipFill>
+                    <a:blip r:embed="rId81"/>
+                    <a:stretch>
+                      <a:fillRect/>
+                    </a:stretch>
+                  </pic:blipFill>
+                  <pic:spPr>
+                    <a:xfrm>
+                      <a:off x="0" y="0"/>
+                      <a:ext cx="3567513" cy="1516670"/>
+                    </a:xfrm>
+                    <a:prstGeom prst="rect">
+                      <a:avLst/>
+                    </a:prstGeom>
+                  </pic:spPr>
+                </pic:pic>
+              </a:graphicData>
+            </a:graphic>
+          </wp:inline>
+        </w:drawing>
+      </w:r>
+    </w:p>
+    <w:p>
+      <w:pPr>
+        <w:pStyle w:val="BodyText"/>
+      </w:pPr>
+      <w:r>
+        <w:lastRenderedPageBreak/>
+        <w:t>Fig 5: Security checklist confirming SmartShop meets pre-deployment requirements — passwords are bcrypt-hashed, sessions are destroyed on logout, all SQL queries use parameterized statements, user input is validated, and the .env file keeps credentials out of the source code.</w:t>
+      </w:r>
+    </w:p>
+    <w:p>
+      <w:pPr>
+        <w:pStyle w:val="BodyText"/>
+      </w:pPr>
+      <w:r>
+        <w:rPr>
+          <w:b/>
+          <w:bCs/>
+        </w:rPr>
+        <w:t xml:space="preserve">Student Reflection </w:t>
+      </w:r>
+    </w:p>
+    <w:p>
+      <w:pPr>
+        <w:pStyle w:val="BodyText"/>
+      </w:pPr>
+      <w:r>
+        <w:t>This final week brought together everything built throughout the semester by focusing on testing, version control, and deployment. The manual testing checklist in Fig 1 verified every SmartShop feature systematically — login, logout, CRUD operations, session management, and responsive layout all passed. Fig 2 shows the GitHub repository with the full commit history documenting each week's development, and Fig 3 shows the terminal commands used to maintain version control throughout the project. Git proved essential for recovering from mistakes and tracking changes over time. Fig 4 shows SmartShop fully deployed and running at localhost:3000, confirming that all layers — Node.js server, Express routes, MySQL database, and EJS templates — are integrated correctly. The security checklist in Fig 5 confirmed that SmartShop follows industry best practices before deployment. This semester's project demonstrated the complete web application development lifecycle: from environment setup and UI design, through server-side development, database integration, authentication, and responsive design, to final testing and version control. Building SmartShop gave me practical experience that directly applies to real-world web development.</w:t>
+      </w:r>
+    </w:p>
+    <w:p>
+      <w:pPr>
+        <w:pStyle w:val="BodyText"/>
+        <w:rPr>
+          <w:i/>
+          <w:iCs/>
+        </w:rPr>
+      </w:pPr>
+      <w:r>
+        <w:rPr>
+          <w:i/>
+          <w:iCs/>
+        </w:rPr>
+        <w:t>BIT3208 – Advanced Web Design and Development</w:t>
+      </w:r>
+    </w:p>
+    <w:p>
+      <w:pPr>
+        <w:pStyle w:val="BodyText"/>
+        <w:rPr>
+          <w:i/>
+          <w:iCs/>
+        </w:rPr>
+      </w:pPr>
+      <w:r>
+        <w:rPr>
+          <w:i/>
+          <w:iCs/>
+        </w:rPr>
         <w:t>Student: Marciah Muringi Gichohi | Admission No: BSCCS/2024/53659</w:t>
       </w:r>
     </w:p>

</xml_diff>